<commit_message>
One-pagers for 2026-10-09 (batch 2: remaining 46 names)
Co-Authored-By: Claude Sonnet 5.5 <noreply@anthropic.com>
Claude-Session: https://claude.ai/code/session_01V36yDoZR5ybbxi7GzJQoix
</commit_message>
<xml_diff>
--- a/one-pagers/2026-10-09/00_summary.docx
+++ b/one-pagers/2026-10-09/00_summary.docx
@@ -510,6 +510,92 @@
           </w:p>
         </w:tc>
       </w:tr>
+      <w:tr>
+        <w:tc>
+          <w:tcPr>
+            <w:tcW w:type="dxa" w:w="1440"/>
+          </w:tcPr>
+          <w:p>
+            <w:r/>
+            <w:r>
+              <w:rPr>
+                <w:sz w:val="17"/>
+              </w:rPr>
+              <w:t>Distress</w:t>
+            </w:r>
+          </w:p>
+        </w:tc>
+        <w:tc>
+          <w:tcPr>
+            <w:tcW w:type="dxa" w:w="1440"/>
+          </w:tcPr>
+          <w:p>
+            <w:r/>
+            <w:r>
+              <w:rPr>
+                <w:sz w:val="17"/>
+              </w:rPr>
+              <w:t>FEAM</w:t>
+            </w:r>
+          </w:p>
+        </w:tc>
+        <w:tc>
+          <w:tcPr>
+            <w:tcW w:type="dxa" w:w="1440"/>
+          </w:tcPr>
+          <w:p>
+            <w:r/>
+            <w:r>
+              <w:rPr>
+                <w:sz w:val="17"/>
+              </w:rPr>
+              <w:t>$164.0M</w:t>
+            </w:r>
+          </w:p>
+        </w:tc>
+        <w:tc>
+          <w:tcPr>
+            <w:tcW w:type="dxa" w:w="1440"/>
+          </w:tcPr>
+          <w:p>
+            <w:r/>
+            <w:r>
+              <w:rPr>
+                <w:sz w:val="17"/>
+              </w:rPr>
+              <w:t>$40.0M</w:t>
+            </w:r>
+          </w:p>
+        </w:tc>
+        <w:tc>
+          <w:tcPr>
+            <w:tcW w:type="dxa" w:w="1440"/>
+          </w:tcPr>
+          <w:p>
+            <w:r/>
+            <w:r>
+              <w:rPr>
+                <w:sz w:val="17"/>
+              </w:rPr>
+              <w:t>24.4%</w:t>
+            </w:r>
+          </w:p>
+        </w:tc>
+        <w:tc>
+          <w:tcPr>
+            <w:tcW w:type="dxa" w:w="1440"/>
+          </w:tcPr>
+          <w:p>
+            <w:r/>
+            <w:r>
+              <w:rPr>
+                <w:sz w:val="17"/>
+              </w:rPr>
+              <w:t>Medium-High</w:t>
+            </w:r>
+          </w:p>
+        </w:tc>
+      </w:tr>
     </w:tbl>
     <w:p>
       <w:pPr>
@@ -11570,6 +11656,3438 @@
                 <w:sz w:val="16"/>
               </w:rPr>
               <w:t>score below research threshold</w:t>
+            </w:r>
+          </w:p>
+        </w:tc>
+      </w:tr>
+    </w:tbl>
+    <w:p>
+      <w:pPr>
+        <w:spacing w:before="280" w:after="120"/>
+      </w:pPr>
+      <w:r>
+        <w:rPr>
+          <w:color w:val="2E74B5"/>
+          <w:sz w:val="32"/>
+        </w:rPr>
+        <w:t>Full Disposition — Batch 2 of 2 (same day): remaining 46 names that qualified at score&gt;=25. Supersedes the 'Not researched - deferred' rows for these 46 tickers in Batch 1's table. No follow-up batches pending. Evidence is from search summaries; filings were not read.</w:t>
+      </w:r>
+    </w:p>
+    <w:tbl>
+      <w:tblPr>
+        <w:tblW w:type="auto" w:w="0"/>
+        <w:tblBorders>
+          <w:top w:val="single" w:sz="4" w:color="auto"/>
+          <w:left w:val="single" w:sz="4" w:color="auto"/>
+          <w:bottom w:val="single" w:sz="4" w:color="auto"/>
+          <w:right w:val="single" w:sz="4" w:color="auto"/>
+          <w:insideH w:val="single" w:sz="4" w:color="auto"/>
+          <w:insideV w:val="single" w:sz="4" w:color="auto"/>
+        </w:tblBorders>
+        <w:tblLook w:firstColumn="1" w:firstRow="1" w:lastColumn="0" w:lastRow="0" w:noHBand="0" w:noVBand="1" w:val="04A0"/>
+      </w:tblPr>
+      <w:tblGrid>
+        <w:gridCol w:w="1728"/>
+        <w:gridCol w:w="1728"/>
+        <w:gridCol w:w="1728"/>
+        <w:gridCol w:w="1728"/>
+        <w:gridCol w:w="1728"/>
+      </w:tblGrid>
+      <w:tr>
+        <w:tc>
+          <w:tcPr>
+            <w:tcW w:type="dxa" w:w="1728"/>
+            <w:shd w:val="clear" w:color="auto" w:fill="2E74B5"/>
+          </w:tcPr>
+          <w:p>
+            <w:r/>
+            <w:r>
+              <w:rPr>
+                <w:b/>
+                <w:color w:val="FFFFFF"/>
+                <w:sz w:val="18"/>
+              </w:rPr>
+              <w:t>Screen</w:t>
+            </w:r>
+          </w:p>
+        </w:tc>
+        <w:tc>
+          <w:tcPr>
+            <w:tcW w:type="dxa" w:w="1728"/>
+            <w:shd w:val="clear" w:color="auto" w:fill="2E74B5"/>
+          </w:tcPr>
+          <w:p>
+            <w:r/>
+            <w:r>
+              <w:rPr>
+                <w:b/>
+                <w:color w:val="FFFFFF"/>
+                <w:sz w:val="18"/>
+              </w:rPr>
+              <w:t>Ticker</w:t>
+            </w:r>
+          </w:p>
+        </w:tc>
+        <w:tc>
+          <w:tcPr>
+            <w:tcW w:type="dxa" w:w="1728"/>
+            <w:shd w:val="clear" w:color="auto" w:fill="2E74B5"/>
+          </w:tcPr>
+          <w:p>
+            <w:r/>
+            <w:r>
+              <w:rPr>
+                <w:b/>
+                <w:color w:val="FFFFFF"/>
+                <w:sz w:val="18"/>
+              </w:rPr>
+              <w:t>Score</w:t>
+            </w:r>
+          </w:p>
+        </w:tc>
+        <w:tc>
+          <w:tcPr>
+            <w:tcW w:type="dxa" w:w="1728"/>
+            <w:shd w:val="clear" w:color="auto" w:fill="2E74B5"/>
+          </w:tcPr>
+          <w:p>
+            <w:r/>
+            <w:r>
+              <w:rPr>
+                <w:b/>
+                <w:color w:val="FFFFFF"/>
+                <w:sz w:val="18"/>
+              </w:rPr>
+              <w:t>Disposition</w:t>
+            </w:r>
+          </w:p>
+        </w:tc>
+        <w:tc>
+          <w:tcPr>
+            <w:tcW w:type="dxa" w:w="1728"/>
+            <w:shd w:val="clear" w:color="auto" w:fill="2E74B5"/>
+          </w:tcPr>
+          <w:p>
+            <w:r/>
+            <w:r>
+              <w:rPr>
+                <w:b/>
+                <w:color w:val="FFFFFF"/>
+                <w:sz w:val="18"/>
+              </w:rPr>
+              <w:t>Reason</w:t>
+            </w:r>
+          </w:p>
+        </w:tc>
+      </w:tr>
+      <w:tr>
+        <w:tc>
+          <w:tcPr>
+            <w:tcW w:type="dxa" w:w="1728"/>
+          </w:tcPr>
+          <w:p>
+            <w:r/>
+            <w:r>
+              <w:rPr>
+                <w:sz w:val="16"/>
+              </w:rPr>
+              <w:t>Up</w:t>
+            </w:r>
+          </w:p>
+        </w:tc>
+        <w:tc>
+          <w:tcPr>
+            <w:tcW w:type="dxa" w:w="1728"/>
+          </w:tcPr>
+          <w:p>
+            <w:r/>
+            <w:r>
+              <w:rPr>
+                <w:sz w:val="16"/>
+              </w:rPr>
+              <w:t>RLGT</w:t>
+            </w:r>
+          </w:p>
+        </w:tc>
+        <w:tc>
+          <w:tcPr>
+            <w:tcW w:type="dxa" w:w="1728"/>
+          </w:tcPr>
+          <w:p>
+            <w:r/>
+            <w:r>
+              <w:rPr>
+                <w:sz w:val="16"/>
+              </w:rPr>
+              <w:t>33.2</w:t>
+            </w:r>
+          </w:p>
+        </w:tc>
+        <w:tc>
+          <w:tcPr>
+            <w:tcW w:type="dxa" w:w="1728"/>
+          </w:tcPr>
+          <w:p>
+            <w:r/>
+            <w:r>
+              <w:rPr>
+                <w:sz w:val="16"/>
+              </w:rPr>
+              <w:t>Drop</w:t>
+            </w:r>
+          </w:p>
+        </w:tc>
+        <w:tc>
+          <w:tcPr>
+            <w:tcW w:type="dxa" w:w="1728"/>
+          </w:tcPr>
+          <w:p>
+            <w:r/>
+            <w:r>
+              <w:rPr>
+                <w:sz w:val="16"/>
+              </w:rPr>
+              <w:t>Profitable, net cash, ~$175M undrawn revolver; debt-financing preference.</w:t>
+            </w:r>
+          </w:p>
+        </w:tc>
+      </w:tr>
+      <w:tr>
+        <w:tc>
+          <w:tcPr>
+            <w:tcW w:type="dxa" w:w="1728"/>
+          </w:tcPr>
+          <w:p>
+            <w:r/>
+            <w:r>
+              <w:rPr>
+                <w:sz w:val="16"/>
+              </w:rPr>
+              <w:t>Up</w:t>
+            </w:r>
+          </w:p>
+        </w:tc>
+        <w:tc>
+          <w:tcPr>
+            <w:tcW w:type="dxa" w:w="1728"/>
+          </w:tcPr>
+          <w:p>
+            <w:r/>
+            <w:r>
+              <w:rPr>
+                <w:sz w:val="16"/>
+              </w:rPr>
+              <w:t>TECX</w:t>
+            </w:r>
+          </w:p>
+        </w:tc>
+        <w:tc>
+          <w:tcPr>
+            <w:tcW w:type="dxa" w:w="1728"/>
+          </w:tcPr>
+          <w:p>
+            <w:r/>
+            <w:r>
+              <w:rPr>
+                <w:sz w:val="16"/>
+              </w:rPr>
+              <w:t>30.5</w:t>
+            </w:r>
+          </w:p>
+        </w:tc>
+        <w:tc>
+          <w:tcPr>
+            <w:tcW w:type="dxa" w:w="1728"/>
+          </w:tcPr>
+          <w:p>
+            <w:r/>
+            <w:r>
+              <w:rPr>
+                <w:sz w:val="16"/>
+              </w:rPr>
+              <w:t>Drop</w:t>
+            </w:r>
+          </w:p>
+        </w:tc>
+        <w:tc>
+          <w:tcPr>
+            <w:tcW w:type="dxa" w:w="1728"/>
+          </w:tcPr>
+          <w:p>
+            <w:r/>
+            <w:r>
+              <w:rPr>
+                <w:sz w:val="16"/>
+              </w:rPr>
+              <w:t>$227M cash, runway into Q1 2029; small ATM drip only.</w:t>
+            </w:r>
+          </w:p>
+        </w:tc>
+      </w:tr>
+      <w:tr>
+        <w:tc>
+          <w:tcPr>
+            <w:tcW w:type="dxa" w:w="1728"/>
+          </w:tcPr>
+          <w:p>
+            <w:r/>
+            <w:r>
+              <w:rPr>
+                <w:sz w:val="16"/>
+              </w:rPr>
+              <w:t>Up</w:t>
+            </w:r>
+          </w:p>
+        </w:tc>
+        <w:tc>
+          <w:tcPr>
+            <w:tcW w:type="dxa" w:w="1728"/>
+          </w:tcPr>
+          <w:p>
+            <w:r/>
+            <w:r>
+              <w:rPr>
+                <w:sz w:val="16"/>
+              </w:rPr>
+              <w:t>CURV</w:t>
+            </w:r>
+          </w:p>
+        </w:tc>
+        <w:tc>
+          <w:tcPr>
+            <w:tcW w:type="dxa" w:w="1728"/>
+          </w:tcPr>
+          <w:p>
+            <w:r/>
+            <w:r>
+              <w:rPr>
+                <w:sz w:val="16"/>
+              </w:rPr>
+              <w:t>30.2</w:t>
+            </w:r>
+          </w:p>
+        </w:tc>
+        <w:tc>
+          <w:tcPr>
+            <w:tcW w:type="dxa" w:w="1728"/>
+          </w:tcPr>
+          <w:p>
+            <w:r/>
+            <w:r>
+              <w:rPr>
+                <w:sz w:val="16"/>
+              </w:rPr>
+              <w:t>Drop</w:t>
+            </w:r>
+          </w:p>
+        </w:tc>
+        <w:tc>
+          <w:tcPr>
+            <w:tcW w:type="dxa" w:w="1728"/>
+          </w:tcPr>
+          <w:p>
+            <w:r/>
+            <w:r>
+              <w:rPr>
+                <w:sz w:val="16"/>
+              </w:rPr>
+              <w:t>Q2 profit (tariff-refund aided); debt-financed, buyback behavior; no going-concern found.</w:t>
+            </w:r>
+          </w:p>
+        </w:tc>
+      </w:tr>
+      <w:tr>
+        <w:tc>
+          <w:tcPr>
+            <w:tcW w:type="dxa" w:w="1728"/>
+          </w:tcPr>
+          <w:p>
+            <w:r/>
+            <w:r>
+              <w:rPr>
+                <w:sz w:val="16"/>
+              </w:rPr>
+              <w:t>Up</w:t>
+            </w:r>
+          </w:p>
+        </w:tc>
+        <w:tc>
+          <w:tcPr>
+            <w:tcW w:type="dxa" w:w="1728"/>
+          </w:tcPr>
+          <w:p>
+            <w:r/>
+            <w:r>
+              <w:rPr>
+                <w:sz w:val="16"/>
+              </w:rPr>
+              <w:t>GCO</w:t>
+            </w:r>
+          </w:p>
+        </w:tc>
+        <w:tc>
+          <w:tcPr>
+            <w:tcW w:type="dxa" w:w="1728"/>
+          </w:tcPr>
+          <w:p>
+            <w:r/>
+            <w:r>
+              <w:rPr>
+                <w:sz w:val="16"/>
+              </w:rPr>
+              <w:t>30.2</w:t>
+            </w:r>
+          </w:p>
+        </w:tc>
+        <w:tc>
+          <w:tcPr>
+            <w:tcW w:type="dxa" w:w="1728"/>
+          </w:tcPr>
+          <w:p>
+            <w:r/>
+            <w:r>
+              <w:rPr>
+                <w:sz w:val="16"/>
+              </w:rPr>
+              <w:t>Drop</w:t>
+            </w:r>
+          </w:p>
+        </w:tc>
+        <w:tc>
+          <w:tcPr>
+            <w:tcW w:type="dxa" w:w="1728"/>
+          </w:tcPr>
+          <w:p>
+            <w:r/>
+            <w:r>
+              <w:rPr>
+                <w:sz w:val="16"/>
+              </w:rPr>
+              <w:t>Minimal debt ($3.4M), $317M revolver availability.</w:t>
+            </w:r>
+          </w:p>
+        </w:tc>
+      </w:tr>
+      <w:tr>
+        <w:tc>
+          <w:tcPr>
+            <w:tcW w:type="dxa" w:w="1728"/>
+          </w:tcPr>
+          <w:p>
+            <w:r/>
+            <w:r>
+              <w:rPr>
+                <w:sz w:val="16"/>
+              </w:rPr>
+              <w:t>Up</w:t>
+            </w:r>
+          </w:p>
+        </w:tc>
+        <w:tc>
+          <w:tcPr>
+            <w:tcW w:type="dxa" w:w="1728"/>
+          </w:tcPr>
+          <w:p>
+            <w:r/>
+            <w:r>
+              <w:rPr>
+                <w:sz w:val="16"/>
+              </w:rPr>
+              <w:t>TITN</w:t>
+            </w:r>
+          </w:p>
+        </w:tc>
+        <w:tc>
+          <w:tcPr>
+            <w:tcW w:type="dxa" w:w="1728"/>
+          </w:tcPr>
+          <w:p>
+            <w:r/>
+            <w:r>
+              <w:rPr>
+                <w:sz w:val="16"/>
+              </w:rPr>
+              <w:t>30.2</w:t>
+            </w:r>
+          </w:p>
+        </w:tc>
+        <w:tc>
+          <w:tcPr>
+            <w:tcW w:type="dxa" w:w="1728"/>
+          </w:tcPr>
+          <w:p>
+            <w:r/>
+            <w:r>
+              <w:rPr>
+                <w:sz w:val="16"/>
+              </w:rPr>
+              <w:t>Drop</w:t>
+            </w:r>
+          </w:p>
+        </w:tc>
+        <w:tc>
+          <w:tcPr>
+            <w:tcW w:type="dxa" w:w="1728"/>
+          </w:tcPr>
+          <w:p>
+            <w:r/>
+            <w:r>
+              <w:rPr>
+                <w:sz w:val="16"/>
+              </w:rPr>
+              <w:t>Q2 loss but financing via asset sales and floorplan; no equity need or going-concern signal found.</w:t>
+            </w:r>
+          </w:p>
+        </w:tc>
+      </w:tr>
+      <w:tr>
+        <w:tc>
+          <w:tcPr>
+            <w:tcW w:type="dxa" w:w="1728"/>
+          </w:tcPr>
+          <w:p>
+            <w:r/>
+            <w:r>
+              <w:rPr>
+                <w:sz w:val="16"/>
+              </w:rPr>
+              <w:t>Up</w:t>
+            </w:r>
+          </w:p>
+        </w:tc>
+        <w:tc>
+          <w:tcPr>
+            <w:tcW w:type="dxa" w:w="1728"/>
+          </w:tcPr>
+          <w:p>
+            <w:r/>
+            <w:r>
+              <w:rPr>
+                <w:sz w:val="16"/>
+              </w:rPr>
+              <w:t>PACB</w:t>
+            </w:r>
+          </w:p>
+        </w:tc>
+        <w:tc>
+          <w:tcPr>
+            <w:tcW w:type="dxa" w:w="1728"/>
+          </w:tcPr>
+          <w:p>
+            <w:r/>
+            <w:r>
+              <w:rPr>
+                <w:sz w:val="16"/>
+              </w:rPr>
+              <w:t>29.8</w:t>
+            </w:r>
+          </w:p>
+        </w:tc>
+        <w:tc>
+          <w:tcPr>
+            <w:tcW w:type="dxa" w:w="1728"/>
+          </w:tcPr>
+          <w:p>
+            <w:r/>
+            <w:r>
+              <w:rPr>
+                <w:sz w:val="16"/>
+              </w:rPr>
+              <w:t>Drop</w:t>
+            </w:r>
+          </w:p>
+        </w:tc>
+        <w:tc>
+          <w:tcPr>
+            <w:tcW w:type="dxa" w:w="1728"/>
+          </w:tcPr>
+          <w:p>
+            <w:r/>
+            <w:r>
+              <w:rPr>
+                <w:sz w:val="16"/>
+              </w:rPr>
+              <w:t>$237M cash; revealed preference for debt exchanges and asset sales over equity.</w:t>
+            </w:r>
+          </w:p>
+        </w:tc>
+      </w:tr>
+      <w:tr>
+        <w:tc>
+          <w:tcPr>
+            <w:tcW w:type="dxa" w:w="1728"/>
+          </w:tcPr>
+          <w:p>
+            <w:r/>
+            <w:r>
+              <w:rPr>
+                <w:sz w:val="16"/>
+              </w:rPr>
+              <w:t>Up</w:t>
+            </w:r>
+          </w:p>
+        </w:tc>
+        <w:tc>
+          <w:tcPr>
+            <w:tcW w:type="dxa" w:w="1728"/>
+          </w:tcPr>
+          <w:p>
+            <w:r/>
+            <w:r>
+              <w:rPr>
+                <w:sz w:val="16"/>
+              </w:rPr>
+              <w:t>NVAX</w:t>
+            </w:r>
+          </w:p>
+        </w:tc>
+        <w:tc>
+          <w:tcPr>
+            <w:tcW w:type="dxa" w:w="1728"/>
+          </w:tcPr>
+          <w:p>
+            <w:r/>
+            <w:r>
+              <w:rPr>
+                <w:sz w:val="16"/>
+              </w:rPr>
+              <w:t>28.2</w:t>
+            </w:r>
+          </w:p>
+        </w:tc>
+        <w:tc>
+          <w:tcPr>
+            <w:tcW w:type="dxa" w:w="1728"/>
+          </w:tcPr>
+          <w:p>
+            <w:r/>
+            <w:r>
+              <w:rPr>
+                <w:sz w:val="16"/>
+              </w:rPr>
+              <w:t>Drop</w:t>
+            </w:r>
+          </w:p>
+        </w:tc>
+        <w:tc>
+          <w:tcPr>
+            <w:tcW w:type="dxa" w:w="1728"/>
+          </w:tcPr>
+          <w:p>
+            <w:r/>
+            <w:r>
+              <w:rPr>
+                <w:sz w:val="16"/>
+              </w:rPr>
+              <w:t>$724M cash, runway at least two years; convertible refinanced 2025.</w:t>
+            </w:r>
+          </w:p>
+        </w:tc>
+      </w:tr>
+      <w:tr>
+        <w:tc>
+          <w:tcPr>
+            <w:tcW w:type="dxa" w:w="1728"/>
+          </w:tcPr>
+          <w:p>
+            <w:r/>
+            <w:r>
+              <w:rPr>
+                <w:sz w:val="16"/>
+              </w:rPr>
+              <w:t>Up</w:t>
+            </w:r>
+          </w:p>
+        </w:tc>
+        <w:tc>
+          <w:tcPr>
+            <w:tcW w:type="dxa" w:w="1728"/>
+          </w:tcPr>
+          <w:p>
+            <w:r/>
+            <w:r>
+              <w:rPr>
+                <w:sz w:val="16"/>
+              </w:rPr>
+              <w:t>HRMY</w:t>
+            </w:r>
+          </w:p>
+        </w:tc>
+        <w:tc>
+          <w:tcPr>
+            <w:tcW w:type="dxa" w:w="1728"/>
+          </w:tcPr>
+          <w:p>
+            <w:r/>
+            <w:r>
+              <w:rPr>
+                <w:sz w:val="16"/>
+              </w:rPr>
+              <w:t>27.2</w:t>
+            </w:r>
+          </w:p>
+        </w:tc>
+        <w:tc>
+          <w:tcPr>
+            <w:tcW w:type="dxa" w:w="1728"/>
+          </w:tcPr>
+          <w:p>
+            <w:r/>
+            <w:r>
+              <w:rPr>
+                <w:sz w:val="16"/>
+              </w:rPr>
+              <w:t>Drop</w:t>
+            </w:r>
+          </w:p>
+        </w:tc>
+        <w:tc>
+          <w:tcPr>
+            <w:tcW w:type="dxa" w:w="1728"/>
+          </w:tcPr>
+          <w:p>
+            <w:r/>
+            <w:r>
+              <w:rPr>
+                <w:sz w:val="16"/>
+              </w:rPr>
+              <w:t>Profitable with $963M cash; self-funded.</w:t>
+            </w:r>
+          </w:p>
+        </w:tc>
+      </w:tr>
+      <w:tr>
+        <w:tc>
+          <w:tcPr>
+            <w:tcW w:type="dxa" w:w="1728"/>
+          </w:tcPr>
+          <w:p>
+            <w:r/>
+            <w:r>
+              <w:rPr>
+                <w:sz w:val="16"/>
+              </w:rPr>
+              <w:t>Up</w:t>
+            </w:r>
+          </w:p>
+        </w:tc>
+        <w:tc>
+          <w:tcPr>
+            <w:tcW w:type="dxa" w:w="1728"/>
+          </w:tcPr>
+          <w:p>
+            <w:r/>
+            <w:r>
+              <w:rPr>
+                <w:sz w:val="16"/>
+              </w:rPr>
+              <w:t>PRSU</w:t>
+            </w:r>
+          </w:p>
+        </w:tc>
+        <w:tc>
+          <w:tcPr>
+            <w:tcW w:type="dxa" w:w="1728"/>
+          </w:tcPr>
+          <w:p>
+            <w:r/>
+            <w:r>
+              <w:rPr>
+                <w:sz w:val="16"/>
+              </w:rPr>
+              <w:t>26.5</w:t>
+            </w:r>
+          </w:p>
+        </w:tc>
+        <w:tc>
+          <w:tcPr>
+            <w:tcW w:type="dxa" w:w="1728"/>
+          </w:tcPr>
+          <w:p>
+            <w:r/>
+            <w:r>
+              <w:rPr>
+                <w:sz w:val="16"/>
+              </w:rPr>
+              <w:t>Drop</w:t>
+            </w:r>
+          </w:p>
+        </w:tc>
+        <w:tc>
+          <w:tcPr>
+            <w:tcW w:type="dxa" w:w="1728"/>
+          </w:tcPr>
+          <w:p>
+            <w:r/>
+            <w:r>
+              <w:rPr>
+                <w:sz w:val="16"/>
+              </w:rPr>
+              <w:t>Profitable in Q2, $124M undrawn revolver; financing via debt and asset sales.</w:t>
+            </w:r>
+          </w:p>
+        </w:tc>
+      </w:tr>
+      <w:tr>
+        <w:tc>
+          <w:tcPr>
+            <w:tcW w:type="dxa" w:w="1728"/>
+          </w:tcPr>
+          <w:p>
+            <w:r/>
+            <w:r>
+              <w:rPr>
+                <w:sz w:val="16"/>
+              </w:rPr>
+              <w:t>Up</w:t>
+            </w:r>
+          </w:p>
+        </w:tc>
+        <w:tc>
+          <w:tcPr>
+            <w:tcW w:type="dxa" w:w="1728"/>
+          </w:tcPr>
+          <w:p>
+            <w:r/>
+            <w:r>
+              <w:rPr>
+                <w:sz w:val="16"/>
+              </w:rPr>
+              <w:t>APPN</w:t>
+            </w:r>
+          </w:p>
+        </w:tc>
+        <w:tc>
+          <w:tcPr>
+            <w:tcW w:type="dxa" w:w="1728"/>
+          </w:tcPr>
+          <w:p>
+            <w:r/>
+            <w:r>
+              <w:rPr>
+                <w:sz w:val="16"/>
+              </w:rPr>
+              <w:t>25.2</w:t>
+            </w:r>
+          </w:p>
+        </w:tc>
+        <w:tc>
+          <w:tcPr>
+            <w:tcW w:type="dxa" w:w="1728"/>
+          </w:tcPr>
+          <w:p>
+            <w:r/>
+            <w:r>
+              <w:rPr>
+                <w:sz w:val="16"/>
+              </w:rPr>
+              <w:t>Drop</w:t>
+            </w:r>
+          </w:p>
+        </w:tc>
+        <w:tc>
+          <w:tcPr>
+            <w:tcW w:type="dxa" w:w="1728"/>
+          </w:tcPr>
+          <w:p>
+            <w:r/>
+            <w:r>
+              <w:rPr>
+                <w:sz w:val="16"/>
+              </w:rPr>
+              <w:t>Refinanced into new $300M facility Aug 2026; buybacks; cash-flow positive.</w:t>
+            </w:r>
+          </w:p>
+        </w:tc>
+      </w:tr>
+      <w:tr>
+        <w:tc>
+          <w:tcPr>
+            <w:tcW w:type="dxa" w:w="1728"/>
+          </w:tcPr>
+          <w:p>
+            <w:r/>
+            <w:r>
+              <w:rPr>
+                <w:sz w:val="16"/>
+              </w:rPr>
+              <w:t>Up</w:t>
+            </w:r>
+          </w:p>
+        </w:tc>
+        <w:tc>
+          <w:tcPr>
+            <w:tcW w:type="dxa" w:w="1728"/>
+          </w:tcPr>
+          <w:p>
+            <w:r/>
+            <w:r>
+              <w:rPr>
+                <w:sz w:val="16"/>
+              </w:rPr>
+              <w:t>CBRL</w:t>
+            </w:r>
+          </w:p>
+        </w:tc>
+        <w:tc>
+          <w:tcPr>
+            <w:tcW w:type="dxa" w:w="1728"/>
+          </w:tcPr>
+          <w:p>
+            <w:r/>
+            <w:r>
+              <w:rPr>
+                <w:sz w:val="16"/>
+              </w:rPr>
+              <w:t>25.0</w:t>
+            </w:r>
+          </w:p>
+        </w:tc>
+        <w:tc>
+          <w:tcPr>
+            <w:tcW w:type="dxa" w:w="1728"/>
+          </w:tcPr>
+          <w:p>
+            <w:r/>
+            <w:r>
+              <w:rPr>
+                <w:sz w:val="16"/>
+              </w:rPr>
+              <w:t>Drop</w:t>
+            </w:r>
+          </w:p>
+        </w:tc>
+        <w:tc>
+          <w:tcPr>
+            <w:tcW w:type="dxa" w:w="1728"/>
+          </w:tcPr>
+          <w:p>
+            <w:r/>
+            <w:r>
+              <w:rPr>
+                <w:sz w:val="16"/>
+              </w:rPr>
+              <w:t>$0 drawn on $550M revolver; financing via debt and sale-leaseback.</w:t>
+            </w:r>
+          </w:p>
+        </w:tc>
+      </w:tr>
+      <w:tr>
+        <w:tc>
+          <w:tcPr>
+            <w:tcW w:type="dxa" w:w="1728"/>
+          </w:tcPr>
+          <w:p>
+            <w:r/>
+            <w:r>
+              <w:rPr>
+                <w:sz w:val="16"/>
+              </w:rPr>
+              <w:t>Up</w:t>
+            </w:r>
+          </w:p>
+        </w:tc>
+        <w:tc>
+          <w:tcPr>
+            <w:tcW w:type="dxa" w:w="1728"/>
+          </w:tcPr>
+          <w:p>
+            <w:r/>
+            <w:r>
+              <w:rPr>
+                <w:sz w:val="16"/>
+              </w:rPr>
+              <w:t>JILL</w:t>
+            </w:r>
+          </w:p>
+        </w:tc>
+        <w:tc>
+          <w:tcPr>
+            <w:tcW w:type="dxa" w:w="1728"/>
+          </w:tcPr>
+          <w:p>
+            <w:r/>
+            <w:r>
+              <w:rPr>
+                <w:sz w:val="16"/>
+              </w:rPr>
+              <w:t>25.0</w:t>
+            </w:r>
+          </w:p>
+        </w:tc>
+        <w:tc>
+          <w:tcPr>
+            <w:tcW w:type="dxa" w:w="1728"/>
+          </w:tcPr>
+          <w:p>
+            <w:r/>
+            <w:r>
+              <w:rPr>
+                <w:sz w:val="16"/>
+              </w:rPr>
+              <w:t>Drop</w:t>
+            </w:r>
+          </w:p>
+        </w:tc>
+        <w:tc>
+          <w:tcPr>
+            <w:tcW w:type="dxa" w:w="1728"/>
+          </w:tcPr>
+          <w:p>
+            <w:r/>
+            <w:r>
+              <w:rPr>
+                <w:sz w:val="16"/>
+              </w:rPr>
+              <w:t>Profitable, pays dividend, FCF positive; term-loan refinancing.</w:t>
+            </w:r>
+          </w:p>
+        </w:tc>
+      </w:tr>
+      <w:tr>
+        <w:tc>
+          <w:tcPr>
+            <w:tcW w:type="dxa" w:w="1728"/>
+          </w:tcPr>
+          <w:p>
+            <w:r/>
+            <w:r>
+              <w:rPr>
+                <w:sz w:val="16"/>
+              </w:rPr>
+              <w:t>Up</w:t>
+            </w:r>
+          </w:p>
+        </w:tc>
+        <w:tc>
+          <w:tcPr>
+            <w:tcW w:type="dxa" w:w="1728"/>
+          </w:tcPr>
+          <w:p>
+            <w:r/>
+            <w:r>
+              <w:rPr>
+                <w:sz w:val="16"/>
+              </w:rPr>
+              <w:t>RMR</w:t>
+            </w:r>
+          </w:p>
+        </w:tc>
+        <w:tc>
+          <w:tcPr>
+            <w:tcW w:type="dxa" w:w="1728"/>
+          </w:tcPr>
+          <w:p>
+            <w:r/>
+            <w:r>
+              <w:rPr>
+                <w:sz w:val="16"/>
+              </w:rPr>
+              <w:t>25.0</w:t>
+            </w:r>
+          </w:p>
+        </w:tc>
+        <w:tc>
+          <w:tcPr>
+            <w:tcW w:type="dxa" w:w="1728"/>
+          </w:tcPr>
+          <w:p>
+            <w:r/>
+            <w:r>
+              <w:rPr>
+                <w:sz w:val="16"/>
+              </w:rPr>
+              <w:t>Drop</w:t>
+            </w:r>
+          </w:p>
+        </w:tc>
+        <w:tc>
+          <w:tcPr>
+            <w:tcW w:type="dxa" w:w="1728"/>
+          </w:tcPr>
+          <w:p>
+            <w:r/>
+            <w:r>
+              <w:rPr>
+                <w:sz w:val="16"/>
+              </w:rPr>
+              <w:t>Profitable, pays dividend, ~$75M undrawn revolver.</w:t>
+            </w:r>
+          </w:p>
+        </w:tc>
+      </w:tr>
+      <w:tr>
+        <w:tc>
+          <w:tcPr>
+            <w:tcW w:type="dxa" w:w="1728"/>
+          </w:tcPr>
+          <w:p>
+            <w:r/>
+            <w:r>
+              <w:rPr>
+                <w:sz w:val="16"/>
+              </w:rPr>
+              <w:t>Distress</w:t>
+            </w:r>
+          </w:p>
+        </w:tc>
+        <w:tc>
+          <w:tcPr>
+            <w:tcW w:type="dxa" w:w="1728"/>
+          </w:tcPr>
+          <w:p>
+            <w:r/>
+            <w:r>
+              <w:rPr>
+                <w:sz w:val="16"/>
+              </w:rPr>
+              <w:t>AARD</w:t>
+            </w:r>
+          </w:p>
+        </w:tc>
+        <w:tc>
+          <w:tcPr>
+            <w:tcW w:type="dxa" w:w="1728"/>
+          </w:tcPr>
+          <w:p>
+            <w:r/>
+            <w:r>
+              <w:rPr>
+                <w:sz w:val="16"/>
+              </w:rPr>
+              <w:t>38.0</w:t>
+            </w:r>
+          </w:p>
+        </w:tc>
+        <w:tc>
+          <w:tcPr>
+            <w:tcW w:type="dxa" w:w="1728"/>
+          </w:tcPr>
+          <w:p>
+            <w:r/>
+            <w:r>
+              <w:rPr>
+                <w:sz w:val="16"/>
+              </w:rPr>
+              <w:t>Drop</w:t>
+            </w:r>
+          </w:p>
+        </w:tc>
+        <w:tc>
+          <w:tcPr>
+            <w:tcW w:type="dxa" w:w="1728"/>
+          </w:tcPr>
+          <w:p>
+            <w:r/>
+            <w:r>
+              <w:rPr>
+                <w:sz w:val="16"/>
+              </w:rPr>
+              <w:t>$73.9M cash, runway into late 2027 and a $150M ATM; FDA clinical hold is a risk but no going-concern or near-term need found.</w:t>
+            </w:r>
+          </w:p>
+        </w:tc>
+      </w:tr>
+      <w:tr>
+        <w:tc>
+          <w:tcPr>
+            <w:tcW w:type="dxa" w:w="1728"/>
+          </w:tcPr>
+          <w:p>
+            <w:r/>
+            <w:r>
+              <w:rPr>
+                <w:sz w:val="16"/>
+              </w:rPr>
+              <w:t>Distress</w:t>
+            </w:r>
+          </w:p>
+        </w:tc>
+        <w:tc>
+          <w:tcPr>
+            <w:tcW w:type="dxa" w:w="1728"/>
+          </w:tcPr>
+          <w:p>
+            <w:r/>
+            <w:r>
+              <w:rPr>
+                <w:sz w:val="16"/>
+              </w:rPr>
+              <w:t>LRMR</w:t>
+            </w:r>
+          </w:p>
+        </w:tc>
+        <w:tc>
+          <w:tcPr>
+            <w:tcW w:type="dxa" w:w="1728"/>
+          </w:tcPr>
+          <w:p>
+            <w:r/>
+            <w:r>
+              <w:rPr>
+                <w:sz w:val="16"/>
+              </w:rPr>
+              <w:t>38.0</w:t>
+            </w:r>
+          </w:p>
+        </w:tc>
+        <w:tc>
+          <w:tcPr>
+            <w:tcW w:type="dxa" w:w="1728"/>
+          </w:tcPr>
+          <w:p>
+            <w:r/>
+            <w:r>
+              <w:rPr>
+                <w:sz w:val="16"/>
+              </w:rPr>
+              <w:t>Drop</w:t>
+            </w:r>
+          </w:p>
+        </w:tc>
+        <w:tc>
+          <w:tcPr>
+            <w:tcW w:type="dxa" w:w="1728"/>
+          </w:tcPr>
+          <w:p>
+            <w:r/>
+            <w:r>
+              <w:rPr>
+                <w:sz w:val="16"/>
+              </w:rPr>
+              <w:t>Raised $100M in Feb 2026; $156M cash, runway into Q3 2027.</w:t>
+            </w:r>
+          </w:p>
+        </w:tc>
+      </w:tr>
+      <w:tr>
+        <w:tc>
+          <w:tcPr>
+            <w:tcW w:type="dxa" w:w="1728"/>
+          </w:tcPr>
+          <w:p>
+            <w:r/>
+            <w:r>
+              <w:rPr>
+                <w:sz w:val="16"/>
+              </w:rPr>
+              <w:t>Distress</w:t>
+            </w:r>
+          </w:p>
+        </w:tc>
+        <w:tc>
+          <w:tcPr>
+            <w:tcW w:type="dxa" w:w="1728"/>
+          </w:tcPr>
+          <w:p>
+            <w:r/>
+            <w:r>
+              <w:rPr>
+                <w:sz w:val="16"/>
+              </w:rPr>
+              <w:t>RCKT</w:t>
+            </w:r>
+          </w:p>
+        </w:tc>
+        <w:tc>
+          <w:tcPr>
+            <w:tcW w:type="dxa" w:w="1728"/>
+          </w:tcPr>
+          <w:p>
+            <w:r/>
+            <w:r>
+              <w:rPr>
+                <w:sz w:val="16"/>
+              </w:rPr>
+              <w:t>38.0</w:t>
+            </w:r>
+          </w:p>
+        </w:tc>
+        <w:tc>
+          <w:tcPr>
+            <w:tcW w:type="dxa" w:w="1728"/>
+          </w:tcPr>
+          <w:p>
+            <w:r/>
+            <w:r>
+              <w:rPr>
+                <w:sz w:val="16"/>
+              </w:rPr>
+              <w:t>Drop</w:t>
+            </w:r>
+          </w:p>
+        </w:tc>
+        <w:tc>
+          <w:tcPr>
+            <w:tcW w:type="dxa" w:w="1728"/>
+          </w:tcPr>
+          <w:p>
+            <w:r/>
+            <w:r>
+              <w:rPr>
+                <w:sz w:val="16"/>
+              </w:rPr>
+              <w:t>$284M cash after $180M non-dilutive voucher sale; runway into Q2 2028.</w:t>
+            </w:r>
+          </w:p>
+        </w:tc>
+      </w:tr>
+      <w:tr>
+        <w:tc>
+          <w:tcPr>
+            <w:tcW w:type="dxa" w:w="1728"/>
+          </w:tcPr>
+          <w:p>
+            <w:r/>
+            <w:r>
+              <w:rPr>
+                <w:sz w:val="16"/>
+              </w:rPr>
+              <w:t>Distress</w:t>
+            </w:r>
+          </w:p>
+        </w:tc>
+        <w:tc>
+          <w:tcPr>
+            <w:tcW w:type="dxa" w:w="1728"/>
+          </w:tcPr>
+          <w:p>
+            <w:r/>
+            <w:r>
+              <w:rPr>
+                <w:sz w:val="16"/>
+              </w:rPr>
+              <w:t>KRRO</w:t>
+            </w:r>
+          </w:p>
+        </w:tc>
+        <w:tc>
+          <w:tcPr>
+            <w:tcW w:type="dxa" w:w="1728"/>
+          </w:tcPr>
+          <w:p>
+            <w:r/>
+            <w:r>
+              <w:rPr>
+                <w:sz w:val="16"/>
+              </w:rPr>
+              <w:t>36.5</w:t>
+            </w:r>
+          </w:p>
+        </w:tc>
+        <w:tc>
+          <w:tcPr>
+            <w:tcW w:type="dxa" w:w="1728"/>
+          </w:tcPr>
+          <w:p>
+            <w:r/>
+            <w:r>
+              <w:rPr>
+                <w:sz w:val="16"/>
+              </w:rPr>
+              <w:t>Drop</w:t>
+            </w:r>
+          </w:p>
+        </w:tc>
+        <w:tc>
+          <w:tcPr>
+            <w:tcW w:type="dxa" w:w="1728"/>
+          </w:tcPr>
+          <w:p>
+            <w:r/>
+            <w:r>
+              <w:rPr>
+                <w:sz w:val="16"/>
+              </w:rPr>
+              <w:t>$85M PIPE in 2026; $138M cash with runway into 2H 2028.</w:t>
+            </w:r>
+          </w:p>
+        </w:tc>
+      </w:tr>
+      <w:tr>
+        <w:tc>
+          <w:tcPr>
+            <w:tcW w:type="dxa" w:w="1728"/>
+          </w:tcPr>
+          <w:p>
+            <w:r/>
+            <w:r>
+              <w:rPr>
+                <w:sz w:val="16"/>
+              </w:rPr>
+              <w:t>Distress</w:t>
+            </w:r>
+          </w:p>
+        </w:tc>
+        <w:tc>
+          <w:tcPr>
+            <w:tcW w:type="dxa" w:w="1728"/>
+          </w:tcPr>
+          <w:p>
+            <w:r/>
+            <w:r>
+              <w:rPr>
+                <w:sz w:val="16"/>
+              </w:rPr>
+              <w:t>OCUL</w:t>
+            </w:r>
+          </w:p>
+        </w:tc>
+        <w:tc>
+          <w:tcPr>
+            <w:tcW w:type="dxa" w:w="1728"/>
+          </w:tcPr>
+          <w:p>
+            <w:r/>
+            <w:r>
+              <w:rPr>
+                <w:sz w:val="16"/>
+              </w:rPr>
+              <w:t>36.5</w:t>
+            </w:r>
+          </w:p>
+        </w:tc>
+        <w:tc>
+          <w:tcPr>
+            <w:tcW w:type="dxa" w:w="1728"/>
+          </w:tcPr>
+          <w:p>
+            <w:r/>
+            <w:r>
+              <w:rPr>
+                <w:sz w:val="16"/>
+              </w:rPr>
+              <w:t>Drop</w:t>
+            </w:r>
+          </w:p>
+        </w:tc>
+        <w:tc>
+          <w:tcPr>
+            <w:tcW w:type="dxa" w:w="1728"/>
+          </w:tcPr>
+          <w:p>
+            <w:r/>
+            <w:r>
+              <w:rPr>
+                <w:sz w:val="16"/>
+              </w:rPr>
+              <w:t>$599M cash, runway into 2028; no going-concern signal.</w:t>
+            </w:r>
+          </w:p>
+        </w:tc>
+      </w:tr>
+      <w:tr>
+        <w:tc>
+          <w:tcPr>
+            <w:tcW w:type="dxa" w:w="1728"/>
+          </w:tcPr>
+          <w:p>
+            <w:r/>
+            <w:r>
+              <w:rPr>
+                <w:sz w:val="16"/>
+              </w:rPr>
+              <w:t>Distress</w:t>
+            </w:r>
+          </w:p>
+        </w:tc>
+        <w:tc>
+          <w:tcPr>
+            <w:tcW w:type="dxa" w:w="1728"/>
+          </w:tcPr>
+          <w:p>
+            <w:r/>
+            <w:r>
+              <w:rPr>
+                <w:sz w:val="16"/>
+              </w:rPr>
+              <w:t>VYGR</w:t>
+            </w:r>
+          </w:p>
+        </w:tc>
+        <w:tc>
+          <w:tcPr>
+            <w:tcW w:type="dxa" w:w="1728"/>
+          </w:tcPr>
+          <w:p>
+            <w:r/>
+            <w:r>
+              <w:rPr>
+                <w:sz w:val="16"/>
+              </w:rPr>
+              <w:t>35.8</w:t>
+            </w:r>
+          </w:p>
+        </w:tc>
+        <w:tc>
+          <w:tcPr>
+            <w:tcW w:type="dxa" w:w="1728"/>
+          </w:tcPr>
+          <w:p>
+            <w:r/>
+            <w:r>
+              <w:rPr>
+                <w:sz w:val="16"/>
+              </w:rPr>
+              <w:t>Drop</w:t>
+            </w:r>
+          </w:p>
+        </w:tc>
+        <w:tc>
+          <w:tcPr>
+            <w:tcW w:type="dxa" w:w="1728"/>
+          </w:tcPr>
+          <w:p>
+            <w:r/>
+            <w:r>
+              <w:rPr>
+                <w:sz w:val="16"/>
+              </w:rPr>
+              <w:t>$149M cash, runway into 2028 including partner reimbursements; market cap input conflicts with price-implied value.</w:t>
+            </w:r>
+          </w:p>
+        </w:tc>
+      </w:tr>
+      <w:tr>
+        <w:tc>
+          <w:tcPr>
+            <w:tcW w:type="dxa" w:w="1728"/>
+          </w:tcPr>
+          <w:p>
+            <w:r/>
+            <w:r>
+              <w:rPr>
+                <w:sz w:val="16"/>
+              </w:rPr>
+              <w:t>Distress</w:t>
+            </w:r>
+          </w:p>
+        </w:tc>
+        <w:tc>
+          <w:tcPr>
+            <w:tcW w:type="dxa" w:w="1728"/>
+          </w:tcPr>
+          <w:p>
+            <w:r/>
+            <w:r>
+              <w:rPr>
+                <w:sz w:val="16"/>
+              </w:rPr>
+              <w:t>IDR</w:t>
+            </w:r>
+          </w:p>
+        </w:tc>
+        <w:tc>
+          <w:tcPr>
+            <w:tcW w:type="dxa" w:w="1728"/>
+          </w:tcPr>
+          <w:p>
+            <w:r/>
+            <w:r>
+              <w:rPr>
+                <w:sz w:val="16"/>
+              </w:rPr>
+              <w:t>34.0</w:t>
+            </w:r>
+          </w:p>
+        </w:tc>
+        <w:tc>
+          <w:tcPr>
+            <w:tcW w:type="dxa" w:w="1728"/>
+          </w:tcPr>
+          <w:p>
+            <w:r/>
+            <w:r>
+              <w:rPr>
+                <w:sz w:val="16"/>
+              </w:rPr>
+              <w:t>Drop</w:t>
+            </w:r>
+          </w:p>
+        </w:tc>
+        <w:tc>
+          <w:tcPr>
+            <w:tcW w:type="dxa" w:w="1728"/>
+          </w:tcPr>
+          <w:p>
+            <w:r/>
+            <w:r>
+              <w:rPr>
+                <w:sz w:val="16"/>
+              </w:rPr>
+              <w:t>Profitable gold producer, no debt or distress signal found.</w:t>
+            </w:r>
+          </w:p>
+        </w:tc>
+      </w:tr>
+      <w:tr>
+        <w:tc>
+          <w:tcPr>
+            <w:tcW w:type="dxa" w:w="1728"/>
+          </w:tcPr>
+          <w:p>
+            <w:r/>
+            <w:r>
+              <w:rPr>
+                <w:sz w:val="16"/>
+              </w:rPr>
+              <w:t>Distress</w:t>
+            </w:r>
+          </w:p>
+        </w:tc>
+        <w:tc>
+          <w:tcPr>
+            <w:tcW w:type="dxa" w:w="1728"/>
+          </w:tcPr>
+          <w:p>
+            <w:r/>
+            <w:r>
+              <w:rPr>
+                <w:sz w:val="16"/>
+              </w:rPr>
+              <w:t>TMDX</w:t>
+            </w:r>
+          </w:p>
+        </w:tc>
+        <w:tc>
+          <w:tcPr>
+            <w:tcW w:type="dxa" w:w="1728"/>
+          </w:tcPr>
+          <w:p>
+            <w:r/>
+            <w:r>
+              <w:rPr>
+                <w:sz w:val="16"/>
+              </w:rPr>
+              <w:t>32.0</w:t>
+            </w:r>
+          </w:p>
+        </w:tc>
+        <w:tc>
+          <w:tcPr>
+            <w:tcW w:type="dxa" w:w="1728"/>
+          </w:tcPr>
+          <w:p>
+            <w:r/>
+            <w:r>
+              <w:rPr>
+                <w:sz w:val="16"/>
+              </w:rPr>
+              <w:t>Drop</w:t>
+            </w:r>
+          </w:p>
+        </w:tc>
+        <w:tc>
+          <w:tcPr>
+            <w:tcW w:type="dxa" w:w="1728"/>
+          </w:tcPr>
+          <w:p>
+            <w:r/>
+            <w:r>
+              <w:rPr>
+                <w:sz w:val="16"/>
+              </w:rPr>
+              <w:t>Profitable with $473M cash; the distress price move itself was not verified.</w:t>
+            </w:r>
+          </w:p>
+        </w:tc>
+      </w:tr>
+      <w:tr>
+        <w:tc>
+          <w:tcPr>
+            <w:tcW w:type="dxa" w:w="1728"/>
+          </w:tcPr>
+          <w:p>
+            <w:r/>
+            <w:r>
+              <w:rPr>
+                <w:sz w:val="16"/>
+              </w:rPr>
+              <w:t>Distress</w:t>
+            </w:r>
+          </w:p>
+        </w:tc>
+        <w:tc>
+          <w:tcPr>
+            <w:tcW w:type="dxa" w:w="1728"/>
+          </w:tcPr>
+          <w:p>
+            <w:r/>
+            <w:r>
+              <w:rPr>
+                <w:sz w:val="16"/>
+              </w:rPr>
+              <w:t>OPEN</w:t>
+            </w:r>
+          </w:p>
+        </w:tc>
+        <w:tc>
+          <w:tcPr>
+            <w:tcW w:type="dxa" w:w="1728"/>
+          </w:tcPr>
+          <w:p>
+            <w:r/>
+            <w:r>
+              <w:rPr>
+                <w:sz w:val="16"/>
+              </w:rPr>
+              <w:t>31.8</w:t>
+            </w:r>
+          </w:p>
+        </w:tc>
+        <w:tc>
+          <w:tcPr>
+            <w:tcW w:type="dxa" w:w="1728"/>
+          </w:tcPr>
+          <w:p>
+            <w:r/>
+            <w:r>
+              <w:rPr>
+                <w:sz w:val="16"/>
+              </w:rPr>
+              <w:t>Drop</w:t>
+            </w:r>
+          </w:p>
+        </w:tc>
+        <w:tc>
+          <w:tcPr>
+            <w:tcW w:type="dxa" w:w="1728"/>
+          </w:tcPr>
+          <w:p>
+            <w:r/>
+            <w:r>
+              <w:rPr>
+                <w:sz w:val="16"/>
+              </w:rPr>
+              <w:t>Just completed $650M convertible plus buyback; asset-backed financing with large undrawn ABS capacity.</w:t>
+            </w:r>
+          </w:p>
+        </w:tc>
+      </w:tr>
+      <w:tr>
+        <w:tc>
+          <w:tcPr>
+            <w:tcW w:type="dxa" w:w="1728"/>
+          </w:tcPr>
+          <w:p>
+            <w:r/>
+            <w:r>
+              <w:rPr>
+                <w:sz w:val="16"/>
+              </w:rPr>
+              <w:t>Distress</w:t>
+            </w:r>
+          </w:p>
+        </w:tc>
+        <w:tc>
+          <w:tcPr>
+            <w:tcW w:type="dxa" w:w="1728"/>
+          </w:tcPr>
+          <w:p>
+            <w:r/>
+            <w:r>
+              <w:rPr>
+                <w:sz w:val="16"/>
+              </w:rPr>
+              <w:t>FEAM</w:t>
+            </w:r>
+          </w:p>
+        </w:tc>
+        <w:tc>
+          <w:tcPr>
+            <w:tcW w:type="dxa" w:w="1728"/>
+          </w:tcPr>
+          <w:p>
+            <w:r/>
+            <w:r>
+              <w:rPr>
+                <w:sz w:val="16"/>
+              </w:rPr>
+              <w:t>31.5</w:t>
+            </w:r>
+          </w:p>
+        </w:tc>
+        <w:tc>
+          <w:tcPr>
+            <w:tcW w:type="dxa" w:w="1728"/>
+          </w:tcPr>
+          <w:p>
+            <w:r/>
+            <w:r>
+              <w:rPr>
+                <w:sz w:val="16"/>
+              </w:rPr>
+              <w:t>Keep</w:t>
+            </w:r>
+          </w:p>
+        </w:tc>
+        <w:tc>
+          <w:tcPr>
+            <w:tcW w:type="dxa" w:w="1728"/>
+          </w:tcPr>
+          <w:p>
+            <w:r/>
+            <w:r>
+              <w:rPr>
+                <w:sz w:val="16"/>
+              </w:rPr>
+              <w:t>Going-concern language in FY2026 10-K; pre-revenue; last raise Feb 2026 (8 months ago); EXIM financing non-binding.</w:t>
+            </w:r>
+          </w:p>
+        </w:tc>
+      </w:tr>
+      <w:tr>
+        <w:tc>
+          <w:tcPr>
+            <w:tcW w:type="dxa" w:w="1728"/>
+          </w:tcPr>
+          <w:p>
+            <w:r/>
+            <w:r>
+              <w:rPr>
+                <w:sz w:val="16"/>
+              </w:rPr>
+              <w:t>Distress</w:t>
+            </w:r>
+          </w:p>
+        </w:tc>
+        <w:tc>
+          <w:tcPr>
+            <w:tcW w:type="dxa" w:w="1728"/>
+          </w:tcPr>
+          <w:p>
+            <w:r/>
+            <w:r>
+              <w:rPr>
+                <w:sz w:val="16"/>
+              </w:rPr>
+              <w:t>CATX</w:t>
+            </w:r>
+          </w:p>
+        </w:tc>
+        <w:tc>
+          <w:tcPr>
+            <w:tcW w:type="dxa" w:w="1728"/>
+          </w:tcPr>
+          <w:p>
+            <w:r/>
+            <w:r>
+              <w:rPr>
+                <w:sz w:val="16"/>
+              </w:rPr>
+              <w:t>31.0</w:t>
+            </w:r>
+          </w:p>
+        </w:tc>
+        <w:tc>
+          <w:tcPr>
+            <w:tcW w:type="dxa" w:w="1728"/>
+          </w:tcPr>
+          <w:p>
+            <w:r/>
+            <w:r>
+              <w:rPr>
+                <w:sz w:val="16"/>
+              </w:rPr>
+              <w:t>Drop</w:t>
+            </w:r>
+          </w:p>
+        </w:tc>
+        <w:tc>
+          <w:tcPr>
+            <w:tcW w:type="dxa" w:w="1728"/>
+          </w:tcPr>
+          <w:p>
+            <w:r/>
+            <w:r>
+              <w:rPr>
+                <w:sz w:val="16"/>
+              </w:rPr>
+              <w:t>Raised ~$175M in Feb 2026; $237M cash, runway into late 2027.</w:t>
+            </w:r>
+          </w:p>
+        </w:tc>
+      </w:tr>
+      <w:tr>
+        <w:tc>
+          <w:tcPr>
+            <w:tcW w:type="dxa" w:w="1728"/>
+          </w:tcPr>
+          <w:p>
+            <w:r/>
+            <w:r>
+              <w:rPr>
+                <w:sz w:val="16"/>
+              </w:rPr>
+              <w:t>Distress</w:t>
+            </w:r>
+          </w:p>
+        </w:tc>
+        <w:tc>
+          <w:tcPr>
+            <w:tcW w:type="dxa" w:w="1728"/>
+          </w:tcPr>
+          <w:p>
+            <w:r/>
+            <w:r>
+              <w:rPr>
+                <w:sz w:val="16"/>
+              </w:rPr>
+              <w:t>IMRX</w:t>
+            </w:r>
+          </w:p>
+        </w:tc>
+        <w:tc>
+          <w:tcPr>
+            <w:tcW w:type="dxa" w:w="1728"/>
+          </w:tcPr>
+          <w:p>
+            <w:r/>
+            <w:r>
+              <w:rPr>
+                <w:sz w:val="16"/>
+              </w:rPr>
+              <w:t>30.5</w:t>
+            </w:r>
+          </w:p>
+        </w:tc>
+        <w:tc>
+          <w:tcPr>
+            <w:tcW w:type="dxa" w:w="1728"/>
+          </w:tcPr>
+          <w:p>
+            <w:r/>
+            <w:r>
+              <w:rPr>
+                <w:sz w:val="16"/>
+              </w:rPr>
+              <w:t>Drop</w:t>
+            </w:r>
+          </w:p>
+        </w:tc>
+        <w:tc>
+          <w:tcPr>
+            <w:tcW w:type="dxa" w:w="1728"/>
+          </w:tcPr>
+          <w:p>
+            <w:r/>
+            <w:r>
+              <w:rPr>
+                <w:sz w:val="16"/>
+              </w:rPr>
+              <w:t>$183M cash, runway into 2029.</w:t>
+            </w:r>
+          </w:p>
+        </w:tc>
+      </w:tr>
+      <w:tr>
+        <w:tc>
+          <w:tcPr>
+            <w:tcW w:type="dxa" w:w="1728"/>
+          </w:tcPr>
+          <w:p>
+            <w:r/>
+            <w:r>
+              <w:rPr>
+                <w:sz w:val="16"/>
+              </w:rPr>
+              <w:t>Distress</w:t>
+            </w:r>
+          </w:p>
+        </w:tc>
+        <w:tc>
+          <w:tcPr>
+            <w:tcW w:type="dxa" w:w="1728"/>
+          </w:tcPr>
+          <w:p>
+            <w:r/>
+            <w:r>
+              <w:rPr>
+                <w:sz w:val="16"/>
+              </w:rPr>
+              <w:t>LXEO</w:t>
+            </w:r>
+          </w:p>
+        </w:tc>
+        <w:tc>
+          <w:tcPr>
+            <w:tcW w:type="dxa" w:w="1728"/>
+          </w:tcPr>
+          <w:p>
+            <w:r/>
+            <w:r>
+              <w:rPr>
+                <w:sz w:val="16"/>
+              </w:rPr>
+              <w:t>30.5</w:t>
+            </w:r>
+          </w:p>
+        </w:tc>
+        <w:tc>
+          <w:tcPr>
+            <w:tcW w:type="dxa" w:w="1728"/>
+          </w:tcPr>
+          <w:p>
+            <w:r/>
+            <w:r>
+              <w:rPr>
+                <w:sz w:val="16"/>
+              </w:rPr>
+              <w:t>Drop</w:t>
+            </w:r>
+          </w:p>
+        </w:tc>
+        <w:tc>
+          <w:tcPr>
+            <w:tcW w:type="dxa" w:w="1728"/>
+          </w:tcPr>
+          <w:p>
+            <w:r/>
+            <w:r>
+              <w:rPr>
+                <w:sz w:val="16"/>
+              </w:rPr>
+              <w:t>$234M cash, runway into 2028; ATM used in April 2026.</w:t>
+            </w:r>
+          </w:p>
+        </w:tc>
+      </w:tr>
+      <w:tr>
+        <w:tc>
+          <w:tcPr>
+            <w:tcW w:type="dxa" w:w="1728"/>
+          </w:tcPr>
+          <w:p>
+            <w:r/>
+            <w:r>
+              <w:rPr>
+                <w:sz w:val="16"/>
+              </w:rPr>
+              <w:t>Distress</w:t>
+            </w:r>
+          </w:p>
+        </w:tc>
+        <w:tc>
+          <w:tcPr>
+            <w:tcW w:type="dxa" w:w="1728"/>
+          </w:tcPr>
+          <w:p>
+            <w:r/>
+            <w:r>
+              <w:rPr>
+                <w:sz w:val="16"/>
+              </w:rPr>
+              <w:t>OLMA</w:t>
+            </w:r>
+          </w:p>
+        </w:tc>
+        <w:tc>
+          <w:tcPr>
+            <w:tcW w:type="dxa" w:w="1728"/>
+          </w:tcPr>
+          <w:p>
+            <w:r/>
+            <w:r>
+              <w:rPr>
+                <w:sz w:val="16"/>
+              </w:rPr>
+              <w:t>30.5</w:t>
+            </w:r>
+          </w:p>
+        </w:tc>
+        <w:tc>
+          <w:tcPr>
+            <w:tcW w:type="dxa" w:w="1728"/>
+          </w:tcPr>
+          <w:p>
+            <w:r/>
+            <w:r>
+              <w:rPr>
+                <w:sz w:val="16"/>
+              </w:rPr>
+              <w:t>Drop</w:t>
+            </w:r>
+          </w:p>
+        </w:tc>
+        <w:tc>
+          <w:tcPr>
+            <w:tcW w:type="dxa" w:w="1728"/>
+          </w:tcPr>
+          <w:p>
+            <w:r/>
+            <w:r>
+              <w:rPr>
+                <w:sz w:val="16"/>
+              </w:rPr>
+              <w:t>$461M cash, runway to mid-2028; follow-on in Nov 2025 and active ATM.</w:t>
+            </w:r>
+          </w:p>
+        </w:tc>
+      </w:tr>
+      <w:tr>
+        <w:tc>
+          <w:tcPr>
+            <w:tcW w:type="dxa" w:w="1728"/>
+          </w:tcPr>
+          <w:p>
+            <w:r/>
+            <w:r>
+              <w:rPr>
+                <w:sz w:val="16"/>
+              </w:rPr>
+              <w:t>Distress</w:t>
+            </w:r>
+          </w:p>
+        </w:tc>
+        <w:tc>
+          <w:tcPr>
+            <w:tcW w:type="dxa" w:w="1728"/>
+          </w:tcPr>
+          <w:p>
+            <w:r/>
+            <w:r>
+              <w:rPr>
+                <w:sz w:val="16"/>
+              </w:rPr>
+              <w:t>IHRT</w:t>
+            </w:r>
+          </w:p>
+        </w:tc>
+        <w:tc>
+          <w:tcPr>
+            <w:tcW w:type="dxa" w:w="1728"/>
+          </w:tcPr>
+          <w:p>
+            <w:r/>
+            <w:r>
+              <w:rPr>
+                <w:sz w:val="16"/>
+              </w:rPr>
+              <w:t>30.2</w:t>
+            </w:r>
+          </w:p>
+        </w:tc>
+        <w:tc>
+          <w:tcPr>
+            <w:tcW w:type="dxa" w:w="1728"/>
+          </w:tcPr>
+          <w:p>
+            <w:r/>
+            <w:r>
+              <w:rPr>
+                <w:sz w:val="16"/>
+              </w:rPr>
+              <w:t>Drop</w:t>
+            </w:r>
+          </w:p>
+        </w:tc>
+        <w:tc>
+          <w:tcPr>
+            <w:tcW w:type="dxa" w:w="1728"/>
+          </w:tcPr>
+          <w:p>
+            <w:r/>
+            <w:r>
+              <w:rPr>
+                <w:sz w:val="16"/>
+              </w:rPr>
+              <w:t>$457M liquidity, positive FCF, ABL extended to 2029; no going-concern found.</w:t>
+            </w:r>
+          </w:p>
+        </w:tc>
+      </w:tr>
+      <w:tr>
+        <w:tc>
+          <w:tcPr>
+            <w:tcW w:type="dxa" w:w="1728"/>
+          </w:tcPr>
+          <w:p>
+            <w:r/>
+            <w:r>
+              <w:rPr>
+                <w:sz w:val="16"/>
+              </w:rPr>
+              <w:t>Distress</w:t>
+            </w:r>
+          </w:p>
+        </w:tc>
+        <w:tc>
+          <w:tcPr>
+            <w:tcW w:type="dxa" w:w="1728"/>
+          </w:tcPr>
+          <w:p>
+            <w:r/>
+            <w:r>
+              <w:rPr>
+                <w:sz w:val="16"/>
+              </w:rPr>
+              <w:t>JACK</w:t>
+            </w:r>
+          </w:p>
+        </w:tc>
+        <w:tc>
+          <w:tcPr>
+            <w:tcW w:type="dxa" w:w="1728"/>
+          </w:tcPr>
+          <w:p>
+            <w:r/>
+            <w:r>
+              <w:rPr>
+                <w:sz w:val="16"/>
+              </w:rPr>
+              <w:t>30.2</w:t>
+            </w:r>
+          </w:p>
+        </w:tc>
+        <w:tc>
+          <w:tcPr>
+            <w:tcW w:type="dxa" w:w="1728"/>
+          </w:tcPr>
+          <w:p>
+            <w:r/>
+            <w:r>
+              <w:rPr>
+                <w:sz w:val="16"/>
+              </w:rPr>
+              <w:t>Drop</w:t>
+            </w:r>
+          </w:p>
+        </w:tc>
+        <w:tc>
+          <w:tcPr>
+            <w:tcW w:type="dxa" w:w="1728"/>
+          </w:tcPr>
+          <w:p>
+            <w:r/>
+            <w:r>
+              <w:rPr>
+                <w:sz w:val="16"/>
+              </w:rPr>
+              <w:t>Financing via securitized debt ($500M June 2026) and asset sales; positive earnings from continuing ops.</w:t>
+            </w:r>
+          </w:p>
+        </w:tc>
+      </w:tr>
+      <w:tr>
+        <w:tc>
+          <w:tcPr>
+            <w:tcW w:type="dxa" w:w="1728"/>
+          </w:tcPr>
+          <w:p>
+            <w:r/>
+            <w:r>
+              <w:rPr>
+                <w:sz w:val="16"/>
+              </w:rPr>
+              <w:t>Distress</w:t>
+            </w:r>
+          </w:p>
+        </w:tc>
+        <w:tc>
+          <w:tcPr>
+            <w:tcW w:type="dxa" w:w="1728"/>
+          </w:tcPr>
+          <w:p>
+            <w:r/>
+            <w:r>
+              <w:rPr>
+                <w:sz w:val="16"/>
+              </w:rPr>
+              <w:t>PACK</w:t>
+            </w:r>
+          </w:p>
+        </w:tc>
+        <w:tc>
+          <w:tcPr>
+            <w:tcW w:type="dxa" w:w="1728"/>
+          </w:tcPr>
+          <w:p>
+            <w:r/>
+            <w:r>
+              <w:rPr>
+                <w:sz w:val="16"/>
+              </w:rPr>
+              <w:t>30.2</w:t>
+            </w:r>
+          </w:p>
+        </w:tc>
+        <w:tc>
+          <w:tcPr>
+            <w:tcW w:type="dxa" w:w="1728"/>
+          </w:tcPr>
+          <w:p>
+            <w:r/>
+            <w:r>
+              <w:rPr>
+                <w:sz w:val="16"/>
+              </w:rPr>
+              <w:t>Drop</w:t>
+            </w:r>
+          </w:p>
+        </w:tc>
+        <w:tc>
+          <w:tcPr>
+            <w:tcW w:type="dxa" w:w="1728"/>
+          </w:tcPr>
+          <w:p>
+            <w:r/>
+            <w:r>
+              <w:rPr>
+                <w:sz w:val="16"/>
+              </w:rPr>
+              <w:t>$47M undrawn revolver and term loan due 2031; no going-concern found.</w:t>
+            </w:r>
+          </w:p>
+        </w:tc>
+      </w:tr>
+      <w:tr>
+        <w:tc>
+          <w:tcPr>
+            <w:tcW w:type="dxa" w:w="1728"/>
+          </w:tcPr>
+          <w:p>
+            <w:r/>
+            <w:r>
+              <w:rPr>
+                <w:sz w:val="16"/>
+              </w:rPr>
+              <w:t>Distress</w:t>
+            </w:r>
+          </w:p>
+        </w:tc>
+        <w:tc>
+          <w:tcPr>
+            <w:tcW w:type="dxa" w:w="1728"/>
+          </w:tcPr>
+          <w:p>
+            <w:r/>
+            <w:r>
+              <w:rPr>
+                <w:sz w:val="16"/>
+              </w:rPr>
+              <w:t>CLPT</w:t>
+            </w:r>
+          </w:p>
+        </w:tc>
+        <w:tc>
+          <w:tcPr>
+            <w:tcW w:type="dxa" w:w="1728"/>
+          </w:tcPr>
+          <w:p>
+            <w:r/>
+            <w:r>
+              <w:rPr>
+                <w:sz w:val="16"/>
+              </w:rPr>
+              <w:t>28.2</w:t>
+            </w:r>
+          </w:p>
+        </w:tc>
+        <w:tc>
+          <w:tcPr>
+            <w:tcW w:type="dxa" w:w="1728"/>
+          </w:tcPr>
+          <w:p>
+            <w:r/>
+            <w:r>
+              <w:rPr>
+                <w:sz w:val="16"/>
+              </w:rPr>
+              <w:t>Drop</w:t>
+            </w:r>
+          </w:p>
+        </w:tc>
+        <w:tc>
+          <w:tcPr>
+            <w:tcW w:type="dxa" w:w="1728"/>
+          </w:tcPr>
+          <w:p>
+            <w:r/>
+            <w:r>
+              <w:rPr>
+                <w:sz w:val="16"/>
+              </w:rPr>
+              <w:t>~4 quarters of cash but unused $50M ATM and Oberland facility with undrawn room; no going-concern found.</w:t>
+            </w:r>
+          </w:p>
+        </w:tc>
+      </w:tr>
+      <w:tr>
+        <w:tc>
+          <w:tcPr>
+            <w:tcW w:type="dxa" w:w="1728"/>
+          </w:tcPr>
+          <w:p>
+            <w:r/>
+            <w:r>
+              <w:rPr>
+                <w:sz w:val="16"/>
+              </w:rPr>
+              <w:t>Distress</w:t>
+            </w:r>
+          </w:p>
+        </w:tc>
+        <w:tc>
+          <w:tcPr>
+            <w:tcW w:type="dxa" w:w="1728"/>
+          </w:tcPr>
+          <w:p>
+            <w:r/>
+            <w:r>
+              <w:rPr>
+                <w:sz w:val="16"/>
+              </w:rPr>
+              <w:t>FHTX</w:t>
+            </w:r>
+          </w:p>
+        </w:tc>
+        <w:tc>
+          <w:tcPr>
+            <w:tcW w:type="dxa" w:w="1728"/>
+          </w:tcPr>
+          <w:p>
+            <w:r/>
+            <w:r>
+              <w:rPr>
+                <w:sz w:val="16"/>
+              </w:rPr>
+              <w:t>28.2</w:t>
+            </w:r>
+          </w:p>
+        </w:tc>
+        <w:tc>
+          <w:tcPr>
+            <w:tcW w:type="dxa" w:w="1728"/>
+          </w:tcPr>
+          <w:p>
+            <w:r/>
+            <w:r>
+              <w:rPr>
+                <w:sz w:val="16"/>
+              </w:rPr>
+              <w:t>Drop</w:t>
+            </w:r>
+          </w:p>
+        </w:tc>
+        <w:tc>
+          <w:tcPr>
+            <w:tcW w:type="dxa" w:w="1728"/>
+          </w:tcPr>
+          <w:p>
+            <w:r/>
+            <w:r>
+              <w:rPr>
+                <w:sz w:val="16"/>
+              </w:rPr>
+              <w:t>Raised ~$50M in Jan 2026; $168M cash and 12+ month runway.</w:t>
+            </w:r>
+          </w:p>
+        </w:tc>
+      </w:tr>
+      <w:tr>
+        <w:tc>
+          <w:tcPr>
+            <w:tcW w:type="dxa" w:w="1728"/>
+          </w:tcPr>
+          <w:p>
+            <w:r/>
+            <w:r>
+              <w:rPr>
+                <w:sz w:val="16"/>
+              </w:rPr>
+              <w:t>Distress</w:t>
+            </w:r>
+          </w:p>
+        </w:tc>
+        <w:tc>
+          <w:tcPr>
+            <w:tcW w:type="dxa" w:w="1728"/>
+          </w:tcPr>
+          <w:p>
+            <w:r/>
+            <w:r>
+              <w:rPr>
+                <w:sz w:val="16"/>
+              </w:rPr>
+              <w:t>JANX</w:t>
+            </w:r>
+          </w:p>
+        </w:tc>
+        <w:tc>
+          <w:tcPr>
+            <w:tcW w:type="dxa" w:w="1728"/>
+          </w:tcPr>
+          <w:p>
+            <w:r/>
+            <w:r>
+              <w:rPr>
+                <w:sz w:val="16"/>
+              </w:rPr>
+              <w:t>28.2</w:t>
+            </w:r>
+          </w:p>
+        </w:tc>
+        <w:tc>
+          <w:tcPr>
+            <w:tcW w:type="dxa" w:w="1728"/>
+          </w:tcPr>
+          <w:p>
+            <w:r/>
+            <w:r>
+              <w:rPr>
+                <w:sz w:val="16"/>
+              </w:rPr>
+              <w:t>Drop</w:t>
+            </w:r>
+          </w:p>
+        </w:tc>
+        <w:tc>
+          <w:tcPr>
+            <w:tcW w:type="dxa" w:w="1728"/>
+          </w:tcPr>
+          <w:p>
+            <w:r/>
+            <w:r>
+              <w:rPr>
+                <w:sz w:val="16"/>
+              </w:rPr>
+              <w:t>$971M cash vs $1.13B market cap; no need.</w:t>
+            </w:r>
+          </w:p>
+        </w:tc>
+      </w:tr>
+      <w:tr>
+        <w:tc>
+          <w:tcPr>
+            <w:tcW w:type="dxa" w:w="1728"/>
+          </w:tcPr>
+          <w:p>
+            <w:r/>
+            <w:r>
+              <w:rPr>
+                <w:sz w:val="16"/>
+              </w:rPr>
+              <w:t>Distress</w:t>
+            </w:r>
+          </w:p>
+        </w:tc>
+        <w:tc>
+          <w:tcPr>
+            <w:tcW w:type="dxa" w:w="1728"/>
+          </w:tcPr>
+          <w:p>
+            <w:r/>
+            <w:r>
+              <w:rPr>
+                <w:sz w:val="16"/>
+              </w:rPr>
+              <w:t>LCTX</w:t>
+            </w:r>
+          </w:p>
+        </w:tc>
+        <w:tc>
+          <w:tcPr>
+            <w:tcW w:type="dxa" w:w="1728"/>
+          </w:tcPr>
+          <w:p>
+            <w:r/>
+            <w:r>
+              <w:rPr>
+                <w:sz w:val="16"/>
+              </w:rPr>
+              <w:t>28.2</w:t>
+            </w:r>
+          </w:p>
+        </w:tc>
+        <w:tc>
+          <w:tcPr>
+            <w:tcW w:type="dxa" w:w="1728"/>
+          </w:tcPr>
+          <w:p>
+            <w:r/>
+            <w:r>
+              <w:rPr>
+                <w:sz w:val="16"/>
+              </w:rPr>
+              <w:t>Drop</w:t>
+            </w:r>
+          </w:p>
+        </w:tc>
+        <w:tc>
+          <w:tcPr>
+            <w:tcW w:type="dxa" w:w="1728"/>
+          </w:tcPr>
+          <w:p>
+            <w:r/>
+            <w:r>
+              <w:rPr>
+                <w:sz w:val="16"/>
+              </w:rPr>
+              <w:t>$51M cash, runway into Q3 2028, $60M ATM available.</w:t>
+            </w:r>
+          </w:p>
+        </w:tc>
+      </w:tr>
+      <w:tr>
+        <w:tc>
+          <w:tcPr>
+            <w:tcW w:type="dxa" w:w="1728"/>
+          </w:tcPr>
+          <w:p>
+            <w:r/>
+            <w:r>
+              <w:rPr>
+                <w:sz w:val="16"/>
+              </w:rPr>
+              <w:t>Distress</w:t>
+            </w:r>
+          </w:p>
+        </w:tc>
+        <w:tc>
+          <w:tcPr>
+            <w:tcW w:type="dxa" w:w="1728"/>
+          </w:tcPr>
+          <w:p>
+            <w:r/>
+            <w:r>
+              <w:rPr>
+                <w:sz w:val="16"/>
+              </w:rPr>
+              <w:t>OCGN</w:t>
+            </w:r>
+          </w:p>
+        </w:tc>
+        <w:tc>
+          <w:tcPr>
+            <w:tcW w:type="dxa" w:w="1728"/>
+          </w:tcPr>
+          <w:p>
+            <w:r/>
+            <w:r>
+              <w:rPr>
+                <w:sz w:val="16"/>
+              </w:rPr>
+              <w:t>28.2</w:t>
+            </w:r>
+          </w:p>
+        </w:tc>
+        <w:tc>
+          <w:tcPr>
+            <w:tcW w:type="dxa" w:w="1728"/>
+          </w:tcPr>
+          <w:p>
+            <w:r/>
+            <w:r>
+              <w:rPr>
+                <w:sz w:val="16"/>
+              </w:rPr>
+              <w:t>Drop</w:t>
+            </w:r>
+          </w:p>
+        </w:tc>
+        <w:tc>
+          <w:tcPr>
+            <w:tcW w:type="dxa" w:w="1728"/>
+          </w:tcPr>
+          <w:p>
+            <w:r/>
+            <w:r>
+              <w:rPr>
+                <w:sz w:val="16"/>
+              </w:rPr>
+              <w:t>Closed a $130M convertible in Q2 2026; $100M cash, runway into 2028.</w:t>
+            </w:r>
+          </w:p>
+        </w:tc>
+      </w:tr>
+      <w:tr>
+        <w:tc>
+          <w:tcPr>
+            <w:tcW w:type="dxa" w:w="1728"/>
+          </w:tcPr>
+          <w:p>
+            <w:r/>
+            <w:r>
+              <w:rPr>
+                <w:sz w:val="16"/>
+              </w:rPr>
+              <w:t>Distress</w:t>
+            </w:r>
+          </w:p>
+        </w:tc>
+        <w:tc>
+          <w:tcPr>
+            <w:tcW w:type="dxa" w:w="1728"/>
+          </w:tcPr>
+          <w:p>
+            <w:r/>
+            <w:r>
+              <w:rPr>
+                <w:sz w:val="16"/>
+              </w:rPr>
+              <w:t>RNA</w:t>
+            </w:r>
+          </w:p>
+        </w:tc>
+        <w:tc>
+          <w:tcPr>
+            <w:tcW w:type="dxa" w:w="1728"/>
+          </w:tcPr>
+          <w:p>
+            <w:r/>
+            <w:r>
+              <w:rPr>
+                <w:sz w:val="16"/>
+              </w:rPr>
+              <w:t>28.2</w:t>
+            </w:r>
+          </w:p>
+        </w:tc>
+        <w:tc>
+          <w:tcPr>
+            <w:tcW w:type="dxa" w:w="1728"/>
+          </w:tcPr>
+          <w:p>
+            <w:r/>
+            <w:r>
+              <w:rPr>
+                <w:sz w:val="16"/>
+              </w:rPr>
+              <w:t>Drop</w:t>
+            </w:r>
+          </w:p>
+        </w:tc>
+        <w:tc>
+          <w:tcPr>
+            <w:tcW w:type="dxa" w:w="1728"/>
+          </w:tcPr>
+          <w:p>
+            <w:r/>
+            <w:r>
+              <w:rPr>
+                <w:sz w:val="16"/>
+              </w:rPr>
+              <w:t>$264M cash vs $141M market cap; runway through mid-2028.</w:t>
+            </w:r>
+          </w:p>
+        </w:tc>
+      </w:tr>
+      <w:tr>
+        <w:tc>
+          <w:tcPr>
+            <w:tcW w:type="dxa" w:w="1728"/>
+          </w:tcPr>
+          <w:p>
+            <w:r/>
+            <w:r>
+              <w:rPr>
+                <w:sz w:val="16"/>
+              </w:rPr>
+              <w:t>Distress</w:t>
+            </w:r>
+          </w:p>
+        </w:tc>
+        <w:tc>
+          <w:tcPr>
+            <w:tcW w:type="dxa" w:w="1728"/>
+          </w:tcPr>
+          <w:p>
+            <w:r/>
+            <w:r>
+              <w:rPr>
+                <w:sz w:val="16"/>
+              </w:rPr>
+              <w:t>UPB</w:t>
+            </w:r>
+          </w:p>
+        </w:tc>
+        <w:tc>
+          <w:tcPr>
+            <w:tcW w:type="dxa" w:w="1728"/>
+          </w:tcPr>
+          <w:p>
+            <w:r/>
+            <w:r>
+              <w:rPr>
+                <w:sz w:val="16"/>
+              </w:rPr>
+              <w:t>28.2</w:t>
+            </w:r>
+          </w:p>
+        </w:tc>
+        <w:tc>
+          <w:tcPr>
+            <w:tcW w:type="dxa" w:w="1728"/>
+          </w:tcPr>
+          <w:p>
+            <w:r/>
+            <w:r>
+              <w:rPr>
+                <w:sz w:val="16"/>
+              </w:rPr>
+              <w:t>Drop</w:t>
+            </w:r>
+          </w:p>
+        </w:tc>
+        <w:tc>
+          <w:tcPr>
+            <w:tcW w:type="dxa" w:w="1728"/>
+          </w:tcPr>
+          <w:p>
+            <w:r/>
+            <w:r>
+              <w:rPr>
+                <w:sz w:val="16"/>
+              </w:rPr>
+              <w:t>$261M cash, runway through 2027; no going-concern found (Phase 3 start Q1 2027 is a later funding event).</w:t>
+            </w:r>
+          </w:p>
+        </w:tc>
+      </w:tr>
+      <w:tr>
+        <w:tc>
+          <w:tcPr>
+            <w:tcW w:type="dxa" w:w="1728"/>
+          </w:tcPr>
+          <w:p>
+            <w:r/>
+            <w:r>
+              <w:rPr>
+                <w:sz w:val="16"/>
+              </w:rPr>
+              <w:t>Distress</w:t>
+            </w:r>
+          </w:p>
+        </w:tc>
+        <w:tc>
+          <w:tcPr>
+            <w:tcW w:type="dxa" w:w="1728"/>
+          </w:tcPr>
+          <w:p>
+            <w:r/>
+            <w:r>
+              <w:rPr>
+                <w:sz w:val="16"/>
+              </w:rPr>
+              <w:t>KNF</w:t>
+            </w:r>
+          </w:p>
+        </w:tc>
+        <w:tc>
+          <w:tcPr>
+            <w:tcW w:type="dxa" w:w="1728"/>
+          </w:tcPr>
+          <w:p>
+            <w:r/>
+            <w:r>
+              <w:rPr>
+                <w:sz w:val="16"/>
+              </w:rPr>
+              <w:t>28.0</w:t>
+            </w:r>
+          </w:p>
+        </w:tc>
+        <w:tc>
+          <w:tcPr>
+            <w:tcW w:type="dxa" w:w="1728"/>
+          </w:tcPr>
+          <w:p>
+            <w:r/>
+            <w:r>
+              <w:rPr>
+                <w:sz w:val="16"/>
+              </w:rPr>
+              <w:t>Drop</w:t>
+            </w:r>
+          </w:p>
+        </w:tc>
+        <w:tc>
+          <w:tcPr>
+            <w:tcW w:type="dxa" w:w="1728"/>
+          </w:tcPr>
+          <w:p>
+            <w:r/>
+            <w:r>
+              <w:rPr>
+                <w:sz w:val="16"/>
+              </w:rPr>
+              <w:t>Profitable; refinanced term loan in May 2026; debt-financed.</w:t>
+            </w:r>
+          </w:p>
+        </w:tc>
+      </w:tr>
+      <w:tr>
+        <w:tc>
+          <w:tcPr>
+            <w:tcW w:type="dxa" w:w="1728"/>
+          </w:tcPr>
+          <w:p>
+            <w:r/>
+            <w:r>
+              <w:rPr>
+                <w:sz w:val="16"/>
+              </w:rPr>
+              <w:t>Distress</w:t>
+            </w:r>
+          </w:p>
+        </w:tc>
+        <w:tc>
+          <w:tcPr>
+            <w:tcW w:type="dxa" w:w="1728"/>
+          </w:tcPr>
+          <w:p>
+            <w:r/>
+            <w:r>
+              <w:rPr>
+                <w:sz w:val="16"/>
+              </w:rPr>
+              <w:t>NNE</w:t>
+            </w:r>
+          </w:p>
+        </w:tc>
+        <w:tc>
+          <w:tcPr>
+            <w:tcW w:type="dxa" w:w="1728"/>
+          </w:tcPr>
+          <w:p>
+            <w:r/>
+            <w:r>
+              <w:rPr>
+                <w:sz w:val="16"/>
+              </w:rPr>
+              <w:t>27.0</w:t>
+            </w:r>
+          </w:p>
+        </w:tc>
+        <w:tc>
+          <w:tcPr>
+            <w:tcW w:type="dxa" w:w="1728"/>
+          </w:tcPr>
+          <w:p>
+            <w:r/>
+            <w:r>
+              <w:rPr>
+                <w:sz w:val="16"/>
+              </w:rPr>
+              <w:t>Drop</w:t>
+            </w:r>
+          </w:p>
+        </w:tc>
+        <w:tc>
+          <w:tcPr>
+            <w:tcW w:type="dxa" w:w="1728"/>
+          </w:tcPr>
+          <w:p>
+            <w:r/>
+            <w:r>
+              <w:rPr>
+                <w:sz w:val="16"/>
+              </w:rPr>
+              <w:t>~$580M cash after $400M PIPE (Oct 2025) and active ATM.</w:t>
+            </w:r>
+          </w:p>
+        </w:tc>
+      </w:tr>
+      <w:tr>
+        <w:tc>
+          <w:tcPr>
+            <w:tcW w:type="dxa" w:w="1728"/>
+          </w:tcPr>
+          <w:p>
+            <w:r/>
+            <w:r>
+              <w:rPr>
+                <w:sz w:val="16"/>
+              </w:rPr>
+              <w:t>Distress</w:t>
+            </w:r>
+          </w:p>
+        </w:tc>
+        <w:tc>
+          <w:tcPr>
+            <w:tcW w:type="dxa" w:w="1728"/>
+          </w:tcPr>
+          <w:p>
+            <w:r/>
+            <w:r>
+              <w:rPr>
+                <w:sz w:val="16"/>
+              </w:rPr>
+              <w:t>INDI</w:t>
+            </w:r>
+          </w:p>
+        </w:tc>
+        <w:tc>
+          <w:tcPr>
+            <w:tcW w:type="dxa" w:w="1728"/>
+          </w:tcPr>
+          <w:p>
+            <w:r/>
+            <w:r>
+              <w:rPr>
+                <w:sz w:val="16"/>
+              </w:rPr>
+              <w:t>26.2</w:t>
+            </w:r>
+          </w:p>
+        </w:tc>
+        <w:tc>
+          <w:tcPr>
+            <w:tcW w:type="dxa" w:w="1728"/>
+          </w:tcPr>
+          <w:p>
+            <w:r/>
+            <w:r>
+              <w:rPr>
+                <w:sz w:val="16"/>
+              </w:rPr>
+              <w:t>Drop</w:t>
+            </w:r>
+          </w:p>
+        </w:tc>
+        <w:tc>
+          <w:tcPr>
+            <w:tcW w:type="dxa" w:w="1728"/>
+          </w:tcPr>
+          <w:p>
+            <w:r/>
+            <w:r>
+              <w:rPr>
+                <w:sz w:val="16"/>
+              </w:rPr>
+              <w:t>Refinanced 2027 converts with a $170.5M 2031 convertible in March 2026; no going-concern found.</w:t>
+            </w:r>
+          </w:p>
+        </w:tc>
+      </w:tr>
+      <w:tr>
+        <w:tc>
+          <w:tcPr>
+            <w:tcW w:type="dxa" w:w="1728"/>
+          </w:tcPr>
+          <w:p>
+            <w:r/>
+            <w:r>
+              <w:rPr>
+                <w:sz w:val="16"/>
+              </w:rPr>
+              <w:t>Distress</w:t>
+            </w:r>
+          </w:p>
+        </w:tc>
+        <w:tc>
+          <w:tcPr>
+            <w:tcW w:type="dxa" w:w="1728"/>
+          </w:tcPr>
+          <w:p>
+            <w:r/>
+            <w:r>
+              <w:rPr>
+                <w:sz w:val="16"/>
+              </w:rPr>
+              <w:t>KPLT</w:t>
+            </w:r>
+          </w:p>
+        </w:tc>
+        <w:tc>
+          <w:tcPr>
+            <w:tcW w:type="dxa" w:w="1728"/>
+          </w:tcPr>
+          <w:p>
+            <w:r/>
+            <w:r>
+              <w:rPr>
+                <w:sz w:val="16"/>
+              </w:rPr>
+              <w:t>25.5</w:t>
+            </w:r>
+          </w:p>
+        </w:tc>
+        <w:tc>
+          <w:tcPr>
+            <w:tcW w:type="dxa" w:w="1728"/>
+          </w:tcPr>
+          <w:p>
+            <w:r/>
+            <w:r>
+              <w:rPr>
+                <w:sz w:val="16"/>
+              </w:rPr>
+              <w:t>Ambiguous</w:t>
+            </w:r>
+          </w:p>
+        </w:tc>
+        <w:tc>
+          <w:tcPr>
+            <w:tcW w:type="dxa" w:w="1728"/>
+          </w:tcPr>
+          <w:p>
+            <w:r/>
+            <w:r>
+              <w:rPr>
+                <w:sz w:val="16"/>
+              </w:rPr>
+              <w:t>Going-concern tied to $74.1M revolver maturing 12/4/2026, but all-stock merger with Aaron's/CCF closed Aug 2026 and post-merger share count, market cap and refinancing status unverified.</w:t>
+            </w:r>
+          </w:p>
+        </w:tc>
+      </w:tr>
+      <w:tr>
+        <w:tc>
+          <w:tcPr>
+            <w:tcW w:type="dxa" w:w="1728"/>
+          </w:tcPr>
+          <w:p>
+            <w:r/>
+            <w:r>
+              <w:rPr>
+                <w:sz w:val="16"/>
+              </w:rPr>
+              <w:t>Distress</w:t>
+            </w:r>
+          </w:p>
+        </w:tc>
+        <w:tc>
+          <w:tcPr>
+            <w:tcW w:type="dxa" w:w="1728"/>
+          </w:tcPr>
+          <w:p>
+            <w:r/>
+            <w:r>
+              <w:rPr>
+                <w:sz w:val="16"/>
+              </w:rPr>
+              <w:t>ALKT</w:t>
+            </w:r>
+          </w:p>
+        </w:tc>
+        <w:tc>
+          <w:tcPr>
+            <w:tcW w:type="dxa" w:w="1728"/>
+          </w:tcPr>
+          <w:p>
+            <w:r/>
+            <w:r>
+              <w:rPr>
+                <w:sz w:val="16"/>
+              </w:rPr>
+              <w:t>25.2</w:t>
+            </w:r>
+          </w:p>
+        </w:tc>
+        <w:tc>
+          <w:tcPr>
+            <w:tcW w:type="dxa" w:w="1728"/>
+          </w:tcPr>
+          <w:p>
+            <w:r/>
+            <w:r>
+              <w:rPr>
+                <w:sz w:val="16"/>
+              </w:rPr>
+              <w:t>Drop</w:t>
+            </w:r>
+          </w:p>
+        </w:tc>
+        <w:tc>
+          <w:tcPr>
+            <w:tcW w:type="dxa" w:w="1728"/>
+          </w:tcPr>
+          <w:p>
+            <w:r/>
+            <w:r>
+              <w:rPr>
+                <w:sz w:val="16"/>
+              </w:rPr>
+              <w:t>Positive FCF, undrawn revolver; activist pressure and reported sale process.</w:t>
+            </w:r>
+          </w:p>
+        </w:tc>
+      </w:tr>
+      <w:tr>
+        <w:tc>
+          <w:tcPr>
+            <w:tcW w:type="dxa" w:w="1728"/>
+          </w:tcPr>
+          <w:p>
+            <w:r/>
+            <w:r>
+              <w:rPr>
+                <w:sz w:val="16"/>
+              </w:rPr>
+              <w:t>Distress</w:t>
+            </w:r>
+          </w:p>
+        </w:tc>
+        <w:tc>
+          <w:tcPr>
+            <w:tcW w:type="dxa" w:w="1728"/>
+          </w:tcPr>
+          <w:p>
+            <w:r/>
+            <w:r>
+              <w:rPr>
+                <w:sz w:val="16"/>
+              </w:rPr>
+              <w:t>HUCK</w:t>
+            </w:r>
+          </w:p>
+        </w:tc>
+        <w:tc>
+          <w:tcPr>
+            <w:tcW w:type="dxa" w:w="1728"/>
+          </w:tcPr>
+          <w:p>
+            <w:r/>
+            <w:r>
+              <w:rPr>
+                <w:sz w:val="16"/>
+              </w:rPr>
+              <w:t>25.2</w:t>
+            </w:r>
+          </w:p>
+        </w:tc>
+        <w:tc>
+          <w:tcPr>
+            <w:tcW w:type="dxa" w:w="1728"/>
+          </w:tcPr>
+          <w:p>
+            <w:r/>
+            <w:r>
+              <w:rPr>
+                <w:sz w:val="16"/>
+              </w:rPr>
+              <w:t>Drop</w:t>
+            </w:r>
+          </w:p>
+        </w:tc>
+        <w:tc>
+          <w:tcPr>
+            <w:tcW w:type="dxa" w:w="1728"/>
+          </w:tcPr>
+          <w:p>
+            <w:r/>
+            <w:r>
+              <w:rPr>
+                <w:sz w:val="16"/>
+              </w:rPr>
+              <w:t>Going-concern was conditional on asset sale, which closed 9/22/2026 for $400M; ~$221M cash.</w:t>
+            </w:r>
+          </w:p>
+        </w:tc>
+      </w:tr>
+      <w:tr>
+        <w:tc>
+          <w:tcPr>
+            <w:tcW w:type="dxa" w:w="1728"/>
+          </w:tcPr>
+          <w:p>
+            <w:r/>
+            <w:r>
+              <w:rPr>
+                <w:sz w:val="16"/>
+              </w:rPr>
+              <w:t>Distress</w:t>
+            </w:r>
+          </w:p>
+        </w:tc>
+        <w:tc>
+          <w:tcPr>
+            <w:tcW w:type="dxa" w:w="1728"/>
+          </w:tcPr>
+          <w:p>
+            <w:r/>
+            <w:r>
+              <w:rPr>
+                <w:sz w:val="16"/>
+              </w:rPr>
+              <w:t>BGS</w:t>
+            </w:r>
+          </w:p>
+        </w:tc>
+        <w:tc>
+          <w:tcPr>
+            <w:tcW w:type="dxa" w:w="1728"/>
+          </w:tcPr>
+          <w:p>
+            <w:r/>
+            <w:r>
+              <w:rPr>
+                <w:sz w:val="16"/>
+              </w:rPr>
+              <w:t>25.0</w:t>
+            </w:r>
+          </w:p>
+        </w:tc>
+        <w:tc>
+          <w:tcPr>
+            <w:tcW w:type="dxa" w:w="1728"/>
+          </w:tcPr>
+          <w:p>
+            <w:r/>
+            <w:r>
+              <w:rPr>
+                <w:sz w:val="16"/>
+              </w:rPr>
+              <w:t>Ambiguous</w:t>
+            </w:r>
+          </w:p>
+        </w:tc>
+        <w:tc>
+          <w:tcPr>
+            <w:tcW w:type="dxa" w:w="1728"/>
+          </w:tcPr>
+          <w:p>
+            <w:r/>
+            <w:r>
+              <w:rPr>
+                <w:sz w:val="16"/>
+              </w:rPr>
+              <w:t>Heavy debt with covenant-risk warnings and 2028 maturities, refinanced 2027 notes with 11% debt in June 2026; no going-concern found and market cap input conflicts with price data.</w:t>
+            </w:r>
+          </w:p>
+        </w:tc>
+      </w:tr>
+      <w:tr>
+        <w:tc>
+          <w:tcPr>
+            <w:tcW w:type="dxa" w:w="1728"/>
+          </w:tcPr>
+          <w:p>
+            <w:r/>
+            <w:r>
+              <w:rPr>
+                <w:sz w:val="16"/>
+              </w:rPr>
+              <w:t>Distress</w:t>
+            </w:r>
+          </w:p>
+        </w:tc>
+        <w:tc>
+          <w:tcPr>
+            <w:tcW w:type="dxa" w:w="1728"/>
+          </w:tcPr>
+          <w:p>
+            <w:r/>
+            <w:r>
+              <w:rPr>
+                <w:sz w:val="16"/>
+              </w:rPr>
+              <w:t>GPI</w:t>
+            </w:r>
+          </w:p>
+        </w:tc>
+        <w:tc>
+          <w:tcPr>
+            <w:tcW w:type="dxa" w:w="1728"/>
+          </w:tcPr>
+          <w:p>
+            <w:r/>
+            <w:r>
+              <w:rPr>
+                <w:sz w:val="16"/>
+              </w:rPr>
+              <w:t>25.0</w:t>
+            </w:r>
+          </w:p>
+        </w:tc>
+        <w:tc>
+          <w:tcPr>
+            <w:tcW w:type="dxa" w:w="1728"/>
+          </w:tcPr>
+          <w:p>
+            <w:r/>
+            <w:r>
+              <w:rPr>
+                <w:sz w:val="16"/>
+              </w:rPr>
+              <w:t>Drop</w:t>
+            </w:r>
+          </w:p>
+        </w:tc>
+        <w:tc>
+          <w:tcPr>
+            <w:tcW w:type="dxa" w:w="1728"/>
+          </w:tcPr>
+          <w:p>
+            <w:r/>
+            <w:r>
+              <w:rPr>
+                <w:sz w:val="16"/>
+              </w:rPr>
+              <w:t>Profitable, dividend-paying, covenants in compliance, ~$1.1B available.</w:t>
+            </w:r>
+          </w:p>
+        </w:tc>
+      </w:tr>
+      <w:tr>
+        <w:tc>
+          <w:tcPr>
+            <w:tcW w:type="dxa" w:w="1728"/>
+          </w:tcPr>
+          <w:p>
+            <w:r/>
+            <w:r>
+              <w:rPr>
+                <w:sz w:val="16"/>
+              </w:rPr>
+              <w:t>Distress</w:t>
+            </w:r>
+          </w:p>
+        </w:tc>
+        <w:tc>
+          <w:tcPr>
+            <w:tcW w:type="dxa" w:w="1728"/>
+          </w:tcPr>
+          <w:p>
+            <w:r/>
+            <w:r>
+              <w:rPr>
+                <w:sz w:val="16"/>
+              </w:rPr>
+              <w:t>GPK</w:t>
+            </w:r>
+          </w:p>
+        </w:tc>
+        <w:tc>
+          <w:tcPr>
+            <w:tcW w:type="dxa" w:w="1728"/>
+          </w:tcPr>
+          <w:p>
+            <w:r/>
+            <w:r>
+              <w:rPr>
+                <w:sz w:val="16"/>
+              </w:rPr>
+              <w:t>25.0</w:t>
+            </w:r>
+          </w:p>
+        </w:tc>
+        <w:tc>
+          <w:tcPr>
+            <w:tcW w:type="dxa" w:w="1728"/>
+          </w:tcPr>
+          <w:p>
+            <w:r/>
+            <w:r>
+              <w:rPr>
+                <w:sz w:val="16"/>
+              </w:rPr>
+              <w:t>Drop</w:t>
+            </w:r>
+          </w:p>
+        </w:tc>
+        <w:tc>
+          <w:tcPr>
+            <w:tcW w:type="dxa" w:w="1728"/>
+          </w:tcPr>
+          <w:p>
+            <w:r/>
+            <w:r>
+              <w:rPr>
+                <w:sz w:val="16"/>
+              </w:rPr>
+              <w:t>Profitable and dividend-paying; deleveraging with debt repayment.</w:t>
             </w:r>
           </w:p>
         </w:tc>

</xml_diff>

<commit_message>
One-pagers for 2026-10-09: Ambiguous names at user request
Co-Authored-By: Claude Sonnet 5.5 <noreply@anthropic.com>
Claude-Session: https://claude.ai/code/session_01V36yDoZR5ybbxi7GzJQoix
</commit_message>
<xml_diff>
--- a/one-pagers/2026-10-09/00_summary.docx
+++ b/one-pagers/2026-10-09/00_summary.docx
@@ -596,6 +596,694 @@
           </w:p>
         </w:tc>
       </w:tr>
+      <w:tr>
+        <w:tc>
+          <w:tcPr>
+            <w:tcW w:type="dxa" w:w="1440"/>
+          </w:tcPr>
+          <w:p>
+            <w:r/>
+            <w:r>
+              <w:rPr>
+                <w:sz w:val="17"/>
+              </w:rPr>
+              <w:t>Distress</w:t>
+            </w:r>
+          </w:p>
+        </w:tc>
+        <w:tc>
+          <w:tcPr>
+            <w:tcW w:type="dxa" w:w="1440"/>
+          </w:tcPr>
+          <w:p>
+            <w:r/>
+            <w:r>
+              <w:rPr>
+                <w:sz w:val="17"/>
+              </w:rPr>
+              <w:t>FIP</w:t>
+            </w:r>
+          </w:p>
+        </w:tc>
+        <w:tc>
+          <w:tcPr>
+            <w:tcW w:type="dxa" w:w="1440"/>
+          </w:tcPr>
+          <w:p>
+            <w:r/>
+            <w:r>
+              <w:rPr>
+                <w:sz w:val="17"/>
+              </w:rPr>
+              <w:t>$314.0M</w:t>
+            </w:r>
+          </w:p>
+        </w:tc>
+        <w:tc>
+          <w:tcPr>
+            <w:tcW w:type="dxa" w:w="1440"/>
+          </w:tcPr>
+          <w:p>
+            <w:r/>
+            <w:r>
+              <w:rPr>
+                <w:sz w:val="17"/>
+              </w:rPr>
+              <w:t>$60.0M</w:t>
+            </w:r>
+          </w:p>
+        </w:tc>
+        <w:tc>
+          <w:tcPr>
+            <w:tcW w:type="dxa" w:w="1440"/>
+          </w:tcPr>
+          <w:p>
+            <w:r/>
+            <w:r>
+              <w:rPr>
+                <w:sz w:val="17"/>
+              </w:rPr>
+              <w:t>19.1%</w:t>
+            </w:r>
+          </w:p>
+        </w:tc>
+        <w:tc>
+          <w:tcPr>
+            <w:tcW w:type="dxa" w:w="1440"/>
+          </w:tcPr>
+          <w:p>
+            <w:r/>
+            <w:r>
+              <w:rPr>
+                <w:sz w:val="17"/>
+              </w:rPr>
+              <w:t>Low-Medium (Ambiguous)</w:t>
+            </w:r>
+          </w:p>
+        </w:tc>
+      </w:tr>
+      <w:tr>
+        <w:tc>
+          <w:tcPr>
+            <w:tcW w:type="dxa" w:w="1440"/>
+          </w:tcPr>
+          <w:p>
+            <w:r/>
+            <w:r>
+              <w:rPr>
+                <w:sz w:val="17"/>
+              </w:rPr>
+              <w:t>Distress</w:t>
+            </w:r>
+          </w:p>
+        </w:tc>
+        <w:tc>
+          <w:tcPr>
+            <w:tcW w:type="dxa" w:w="1440"/>
+          </w:tcPr>
+          <w:p>
+            <w:r/>
+            <w:r>
+              <w:rPr>
+                <w:sz w:val="17"/>
+              </w:rPr>
+              <w:t>LODE</w:t>
+            </w:r>
+          </w:p>
+        </w:tc>
+        <w:tc>
+          <w:tcPr>
+            <w:tcW w:type="dxa" w:w="1440"/>
+          </w:tcPr>
+          <w:p>
+            <w:r/>
+            <w:r>
+              <w:rPr>
+                <w:sz w:val="17"/>
+              </w:rPr>
+              <w:t>$168.0M</w:t>
+            </w:r>
+          </w:p>
+        </w:tc>
+        <w:tc>
+          <w:tcPr>
+            <w:tcW w:type="dxa" w:w="1440"/>
+          </w:tcPr>
+          <w:p>
+            <w:r/>
+            <w:r>
+              <w:rPr>
+                <w:sz w:val="17"/>
+              </w:rPr>
+              <w:t>$40.0M</w:t>
+            </w:r>
+          </w:p>
+        </w:tc>
+        <w:tc>
+          <w:tcPr>
+            <w:tcW w:type="dxa" w:w="1440"/>
+          </w:tcPr>
+          <w:p>
+            <w:r/>
+            <w:r>
+              <w:rPr>
+                <w:sz w:val="17"/>
+              </w:rPr>
+              <w:t>23.8%</w:t>
+            </w:r>
+          </w:p>
+        </w:tc>
+        <w:tc>
+          <w:tcPr>
+            <w:tcW w:type="dxa" w:w="1440"/>
+          </w:tcPr>
+          <w:p>
+            <w:r/>
+            <w:r>
+              <w:rPr>
+                <w:sz w:val="17"/>
+              </w:rPr>
+              <w:t>Medium (Ambiguous)</w:t>
+            </w:r>
+          </w:p>
+        </w:tc>
+      </w:tr>
+      <w:tr>
+        <w:tc>
+          <w:tcPr>
+            <w:tcW w:type="dxa" w:w="1440"/>
+          </w:tcPr>
+          <w:p>
+            <w:r/>
+            <w:r>
+              <w:rPr>
+                <w:sz w:val="17"/>
+              </w:rPr>
+              <w:t>Distress</w:t>
+            </w:r>
+          </w:p>
+        </w:tc>
+        <w:tc>
+          <w:tcPr>
+            <w:tcW w:type="dxa" w:w="1440"/>
+          </w:tcPr>
+          <w:p>
+            <w:r/>
+            <w:r>
+              <w:rPr>
+                <w:sz w:val="17"/>
+              </w:rPr>
+              <w:t>RTB</w:t>
+            </w:r>
+          </w:p>
+        </w:tc>
+        <w:tc>
+          <w:tcPr>
+            <w:tcW w:type="dxa" w:w="1440"/>
+          </w:tcPr>
+          <w:p>
+            <w:r/>
+            <w:r>
+              <w:rPr>
+                <w:sz w:val="17"/>
+              </w:rPr>
+              <w:t>$125.0M</w:t>
+            </w:r>
+          </w:p>
+        </w:tc>
+        <w:tc>
+          <w:tcPr>
+            <w:tcW w:type="dxa" w:w="1440"/>
+          </w:tcPr>
+          <w:p>
+            <w:r/>
+            <w:r>
+              <w:rPr>
+                <w:sz w:val="17"/>
+              </w:rPr>
+              <w:t>$25.0M</w:t>
+            </w:r>
+          </w:p>
+        </w:tc>
+        <w:tc>
+          <w:tcPr>
+            <w:tcW w:type="dxa" w:w="1440"/>
+          </w:tcPr>
+          <w:p>
+            <w:r/>
+            <w:r>
+              <w:rPr>
+                <w:sz w:val="17"/>
+              </w:rPr>
+              <w:t>20.0%</w:t>
+            </w:r>
+          </w:p>
+        </w:tc>
+        <w:tc>
+          <w:tcPr>
+            <w:tcW w:type="dxa" w:w="1440"/>
+          </w:tcPr>
+          <w:p>
+            <w:r/>
+            <w:r>
+              <w:rPr>
+                <w:sz w:val="17"/>
+              </w:rPr>
+              <w:t>Medium-High (Ambiguous)</w:t>
+            </w:r>
+          </w:p>
+        </w:tc>
+      </w:tr>
+      <w:tr>
+        <w:tc>
+          <w:tcPr>
+            <w:tcW w:type="dxa" w:w="1440"/>
+          </w:tcPr>
+          <w:p>
+            <w:r/>
+            <w:r>
+              <w:rPr>
+                <w:sz w:val="17"/>
+              </w:rPr>
+              <w:t>Distress</w:t>
+            </w:r>
+          </w:p>
+        </w:tc>
+        <w:tc>
+          <w:tcPr>
+            <w:tcW w:type="dxa" w:w="1440"/>
+          </w:tcPr>
+          <w:p>
+            <w:r/>
+            <w:r>
+              <w:rPr>
+                <w:sz w:val="17"/>
+              </w:rPr>
+              <w:t>CDZI</w:t>
+            </w:r>
+          </w:p>
+        </w:tc>
+        <w:tc>
+          <w:tcPr>
+            <w:tcW w:type="dxa" w:w="1440"/>
+          </w:tcPr>
+          <w:p>
+            <w:r/>
+            <w:r>
+              <w:rPr>
+                <w:sz w:val="17"/>
+              </w:rPr>
+              <w:t>$298.0M</w:t>
+            </w:r>
+          </w:p>
+        </w:tc>
+        <w:tc>
+          <w:tcPr>
+            <w:tcW w:type="dxa" w:w="1440"/>
+          </w:tcPr>
+          <w:p>
+            <w:r/>
+            <w:r>
+              <w:rPr>
+                <w:sz w:val="17"/>
+              </w:rPr>
+              <w:t>$60.0M</w:t>
+            </w:r>
+          </w:p>
+        </w:tc>
+        <w:tc>
+          <w:tcPr>
+            <w:tcW w:type="dxa" w:w="1440"/>
+          </w:tcPr>
+          <w:p>
+            <w:r/>
+            <w:r>
+              <w:rPr>
+                <w:sz w:val="17"/>
+              </w:rPr>
+              <w:t>20.1%</w:t>
+            </w:r>
+          </w:p>
+        </w:tc>
+        <w:tc>
+          <w:tcPr>
+            <w:tcW w:type="dxa" w:w="1440"/>
+          </w:tcPr>
+          <w:p>
+            <w:r/>
+            <w:r>
+              <w:rPr>
+                <w:sz w:val="17"/>
+              </w:rPr>
+              <w:t>High (Ambiguous)</w:t>
+            </w:r>
+          </w:p>
+        </w:tc>
+      </w:tr>
+      <w:tr>
+        <w:tc>
+          <w:tcPr>
+            <w:tcW w:type="dxa" w:w="1440"/>
+          </w:tcPr>
+          <w:p>
+            <w:r/>
+            <w:r>
+              <w:rPr>
+                <w:sz w:val="17"/>
+              </w:rPr>
+              <w:t>Distress</w:t>
+            </w:r>
+          </w:p>
+        </w:tc>
+        <w:tc>
+          <w:tcPr>
+            <w:tcW w:type="dxa" w:w="1440"/>
+          </w:tcPr>
+          <w:p>
+            <w:r/>
+            <w:r>
+              <w:rPr>
+                <w:sz w:val="17"/>
+              </w:rPr>
+              <w:t>ATER</w:t>
+            </w:r>
+          </w:p>
+        </w:tc>
+        <w:tc>
+          <w:tcPr>
+            <w:tcW w:type="dxa" w:w="1440"/>
+          </w:tcPr>
+          <w:p>
+            <w:r/>
+            <w:r>
+              <w:rPr>
+                <w:sz w:val="17"/>
+              </w:rPr>
+              <w:t>$158.0M</w:t>
+            </w:r>
+          </w:p>
+        </w:tc>
+        <w:tc>
+          <w:tcPr>
+            <w:tcW w:type="dxa" w:w="1440"/>
+          </w:tcPr>
+          <w:p>
+            <w:r/>
+            <w:r>
+              <w:rPr>
+                <w:sz w:val="17"/>
+              </w:rPr>
+              <w:t>$10.0M</w:t>
+            </w:r>
+          </w:p>
+        </w:tc>
+        <w:tc>
+          <w:tcPr>
+            <w:tcW w:type="dxa" w:w="1440"/>
+          </w:tcPr>
+          <w:p>
+            <w:r/>
+            <w:r>
+              <w:rPr>
+                <w:sz w:val="17"/>
+              </w:rPr>
+              <w:t>6.3%</w:t>
+            </w:r>
+          </w:p>
+        </w:tc>
+        <w:tc>
+          <w:tcPr>
+            <w:tcW w:type="dxa" w:w="1440"/>
+          </w:tcPr>
+          <w:p>
+            <w:r/>
+            <w:r>
+              <w:rPr>
+                <w:sz w:val="17"/>
+              </w:rPr>
+              <w:t>High (Ambiguous)</w:t>
+            </w:r>
+          </w:p>
+        </w:tc>
+      </w:tr>
+      <w:tr>
+        <w:tc>
+          <w:tcPr>
+            <w:tcW w:type="dxa" w:w="1440"/>
+          </w:tcPr>
+          <w:p>
+            <w:r/>
+            <w:r>
+              <w:rPr>
+                <w:sz w:val="17"/>
+              </w:rPr>
+              <w:t>Distress</w:t>
+            </w:r>
+          </w:p>
+        </w:tc>
+        <w:tc>
+          <w:tcPr>
+            <w:tcW w:type="dxa" w:w="1440"/>
+          </w:tcPr>
+          <w:p>
+            <w:r/>
+            <w:r>
+              <w:rPr>
+                <w:sz w:val="17"/>
+              </w:rPr>
+              <w:t>AREC</w:t>
+            </w:r>
+          </w:p>
+        </w:tc>
+        <w:tc>
+          <w:tcPr>
+            <w:tcW w:type="dxa" w:w="1440"/>
+          </w:tcPr>
+          <w:p>
+            <w:r/>
+            <w:r>
+              <w:rPr>
+                <w:sz w:val="17"/>
+              </w:rPr>
+              <w:t>$177.0M</w:t>
+            </w:r>
+          </w:p>
+        </w:tc>
+        <w:tc>
+          <w:tcPr>
+            <w:tcW w:type="dxa" w:w="1440"/>
+          </w:tcPr>
+          <w:p>
+            <w:r/>
+            <w:r>
+              <w:rPr>
+                <w:sz w:val="17"/>
+              </w:rPr>
+              <w:t>$35.0M</w:t>
+            </w:r>
+          </w:p>
+        </w:tc>
+        <w:tc>
+          <w:tcPr>
+            <w:tcW w:type="dxa" w:w="1440"/>
+          </w:tcPr>
+          <w:p>
+            <w:r/>
+            <w:r>
+              <w:rPr>
+                <w:sz w:val="17"/>
+              </w:rPr>
+              <w:t>19.8%</w:t>
+            </w:r>
+          </w:p>
+        </w:tc>
+        <w:tc>
+          <w:tcPr>
+            <w:tcW w:type="dxa" w:w="1440"/>
+          </w:tcPr>
+          <w:p>
+            <w:r/>
+            <w:r>
+              <w:rPr>
+                <w:sz w:val="17"/>
+              </w:rPr>
+              <w:t>Low (Ambiguous)</w:t>
+            </w:r>
+          </w:p>
+        </w:tc>
+      </w:tr>
+      <w:tr>
+        <w:tc>
+          <w:tcPr>
+            <w:tcW w:type="dxa" w:w="1440"/>
+          </w:tcPr>
+          <w:p>
+            <w:r/>
+            <w:r>
+              <w:rPr>
+                <w:sz w:val="17"/>
+              </w:rPr>
+              <w:t>Distress</w:t>
+            </w:r>
+          </w:p>
+        </w:tc>
+        <w:tc>
+          <w:tcPr>
+            <w:tcW w:type="dxa" w:w="1440"/>
+          </w:tcPr>
+          <w:p>
+            <w:r/>
+            <w:r>
+              <w:rPr>
+                <w:sz w:val="17"/>
+              </w:rPr>
+              <w:t>KPLT</w:t>
+            </w:r>
+          </w:p>
+        </w:tc>
+        <w:tc>
+          <w:tcPr>
+            <w:tcW w:type="dxa" w:w="1440"/>
+          </w:tcPr>
+          <w:p>
+            <w:r/>
+            <w:r>
+              <w:rPr>
+                <w:sz w:val="17"/>
+              </w:rPr>
+              <w:t>$379.0M</w:t>
+            </w:r>
+          </w:p>
+        </w:tc>
+        <w:tc>
+          <w:tcPr>
+            <w:tcW w:type="dxa" w:w="1440"/>
+          </w:tcPr>
+          <w:p>
+            <w:r/>
+            <w:r>
+              <w:rPr>
+                <w:sz w:val="17"/>
+              </w:rPr>
+              <w:t>$60.0M</w:t>
+            </w:r>
+          </w:p>
+        </w:tc>
+        <w:tc>
+          <w:tcPr>
+            <w:tcW w:type="dxa" w:w="1440"/>
+          </w:tcPr>
+          <w:p>
+            <w:r/>
+            <w:r>
+              <w:rPr>
+                <w:sz w:val="17"/>
+              </w:rPr>
+              <w:t>15.8%</w:t>
+            </w:r>
+          </w:p>
+        </w:tc>
+        <w:tc>
+          <w:tcPr>
+            <w:tcW w:type="dxa" w:w="1440"/>
+          </w:tcPr>
+          <w:p>
+            <w:r/>
+            <w:r>
+              <w:rPr>
+                <w:sz w:val="17"/>
+              </w:rPr>
+              <w:t>Low-Medium (Ambiguous)</w:t>
+            </w:r>
+          </w:p>
+        </w:tc>
+      </w:tr>
+      <w:tr>
+        <w:tc>
+          <w:tcPr>
+            <w:tcW w:type="dxa" w:w="1440"/>
+          </w:tcPr>
+          <w:p>
+            <w:r/>
+            <w:r>
+              <w:rPr>
+                <w:sz w:val="17"/>
+              </w:rPr>
+              <w:t>Distress</w:t>
+            </w:r>
+          </w:p>
+        </w:tc>
+        <w:tc>
+          <w:tcPr>
+            <w:tcW w:type="dxa" w:w="1440"/>
+          </w:tcPr>
+          <w:p>
+            <w:r/>
+            <w:r>
+              <w:rPr>
+                <w:sz w:val="17"/>
+              </w:rPr>
+              <w:t>BGS</w:t>
+            </w:r>
+          </w:p>
+        </w:tc>
+        <w:tc>
+          <w:tcPr>
+            <w:tcW w:type="dxa" w:w="1440"/>
+          </w:tcPr>
+          <w:p>
+            <w:r/>
+            <w:r>
+              <w:rPr>
+                <w:sz w:val="17"/>
+              </w:rPr>
+              <w:t>$213.0M</w:t>
+            </w:r>
+          </w:p>
+        </w:tc>
+        <w:tc>
+          <w:tcPr>
+            <w:tcW w:type="dxa" w:w="1440"/>
+          </w:tcPr>
+          <w:p>
+            <w:r/>
+            <w:r>
+              <w:rPr>
+                <w:sz w:val="17"/>
+              </w:rPr>
+              <w:t>$60.0M</w:t>
+            </w:r>
+          </w:p>
+        </w:tc>
+        <w:tc>
+          <w:tcPr>
+            <w:tcW w:type="dxa" w:w="1440"/>
+          </w:tcPr>
+          <w:p>
+            <w:r/>
+            <w:r>
+              <w:rPr>
+                <w:sz w:val="17"/>
+              </w:rPr>
+              <w:t>28.2%</w:t>
+            </w:r>
+          </w:p>
+        </w:tc>
+        <w:tc>
+          <w:tcPr>
+            <w:tcW w:type="dxa" w:w="1440"/>
+          </w:tcPr>
+          <w:p>
+            <w:r/>
+            <w:r>
+              <w:rPr>
+                <w:sz w:val="17"/>
+              </w:rPr>
+              <w:t>Medium (Ambiguous)</w:t>
+            </w:r>
+          </w:p>
+        </w:tc>
+      </w:tr>
     </w:tbl>
     <w:p>
       <w:pPr>
@@ -15088,6 +15776,702 @@
                 <w:sz w:val="16"/>
               </w:rPr>
               <w:t>Profitable and dividend-paying; deleveraging with debt repayment.</w:t>
+            </w:r>
+          </w:p>
+        </w:tc>
+      </w:tr>
+    </w:tbl>
+    <w:p>
+      <w:pPr>
+        <w:spacing w:before="280" w:after="120"/>
+      </w:pPr>
+      <w:r>
+        <w:rPr>
+          <w:color w:val="2E74B5"/>
+          <w:sz w:val="32"/>
+        </w:rPr>
+        <w:t>Full Disposition — Ambiguous names promoted to one-pagers at user request (same day). Rows below are labelled Ambiguous, not Keep: evidence gaps are stated in each page.</w:t>
+      </w:r>
+    </w:p>
+    <w:tbl>
+      <w:tblPr>
+        <w:tblW w:type="auto" w:w="0"/>
+        <w:tblBorders>
+          <w:top w:val="single" w:sz="4" w:color="auto"/>
+          <w:left w:val="single" w:sz="4" w:color="auto"/>
+          <w:bottom w:val="single" w:sz="4" w:color="auto"/>
+          <w:right w:val="single" w:sz="4" w:color="auto"/>
+          <w:insideH w:val="single" w:sz="4" w:color="auto"/>
+          <w:insideV w:val="single" w:sz="4" w:color="auto"/>
+        </w:tblBorders>
+        <w:tblLook w:firstColumn="1" w:firstRow="1" w:lastColumn="0" w:lastRow="0" w:noHBand="0" w:noVBand="1" w:val="04A0"/>
+      </w:tblPr>
+      <w:tblGrid>
+        <w:gridCol w:w="1728"/>
+        <w:gridCol w:w="1728"/>
+        <w:gridCol w:w="1728"/>
+        <w:gridCol w:w="1728"/>
+        <w:gridCol w:w="1728"/>
+      </w:tblGrid>
+      <w:tr>
+        <w:tc>
+          <w:tcPr>
+            <w:tcW w:type="dxa" w:w="1728"/>
+            <w:shd w:val="clear" w:color="auto" w:fill="2E74B5"/>
+          </w:tcPr>
+          <w:p>
+            <w:r/>
+            <w:r>
+              <w:rPr>
+                <w:b/>
+                <w:color w:val="FFFFFF"/>
+                <w:sz w:val="18"/>
+              </w:rPr>
+              <w:t>Screen</w:t>
+            </w:r>
+          </w:p>
+        </w:tc>
+        <w:tc>
+          <w:tcPr>
+            <w:tcW w:type="dxa" w:w="1728"/>
+            <w:shd w:val="clear" w:color="auto" w:fill="2E74B5"/>
+          </w:tcPr>
+          <w:p>
+            <w:r/>
+            <w:r>
+              <w:rPr>
+                <w:b/>
+                <w:color w:val="FFFFFF"/>
+                <w:sz w:val="18"/>
+              </w:rPr>
+              <w:t>Ticker</w:t>
+            </w:r>
+          </w:p>
+        </w:tc>
+        <w:tc>
+          <w:tcPr>
+            <w:tcW w:type="dxa" w:w="1728"/>
+            <w:shd w:val="clear" w:color="auto" w:fill="2E74B5"/>
+          </w:tcPr>
+          <w:p>
+            <w:r/>
+            <w:r>
+              <w:rPr>
+                <w:b/>
+                <w:color w:val="FFFFFF"/>
+                <w:sz w:val="18"/>
+              </w:rPr>
+              <w:t>Score</w:t>
+            </w:r>
+          </w:p>
+        </w:tc>
+        <w:tc>
+          <w:tcPr>
+            <w:tcW w:type="dxa" w:w="1728"/>
+            <w:shd w:val="clear" w:color="auto" w:fill="2E74B5"/>
+          </w:tcPr>
+          <w:p>
+            <w:r/>
+            <w:r>
+              <w:rPr>
+                <w:b/>
+                <w:color w:val="FFFFFF"/>
+                <w:sz w:val="18"/>
+              </w:rPr>
+              <w:t>Disposition</w:t>
+            </w:r>
+          </w:p>
+        </w:tc>
+        <w:tc>
+          <w:tcPr>
+            <w:tcW w:type="dxa" w:w="1728"/>
+            <w:shd w:val="clear" w:color="auto" w:fill="2E74B5"/>
+          </w:tcPr>
+          <w:p>
+            <w:r/>
+            <w:r>
+              <w:rPr>
+                <w:b/>
+                <w:color w:val="FFFFFF"/>
+                <w:sz w:val="18"/>
+              </w:rPr>
+              <w:t>Reason</w:t>
+            </w:r>
+          </w:p>
+        </w:tc>
+      </w:tr>
+      <w:tr>
+        <w:tc>
+          <w:tcPr>
+            <w:tcW w:type="dxa" w:w="1728"/>
+          </w:tcPr>
+          <w:p>
+            <w:r/>
+            <w:r>
+              <w:rPr>
+                <w:sz w:val="16"/>
+              </w:rPr>
+              <w:t>Distress</w:t>
+            </w:r>
+          </w:p>
+        </w:tc>
+        <w:tc>
+          <w:tcPr>
+            <w:tcW w:type="dxa" w:w="1728"/>
+          </w:tcPr>
+          <w:p>
+            <w:r/>
+            <w:r>
+              <w:rPr>
+                <w:sz w:val="16"/>
+              </w:rPr>
+              <w:t>FIP</w:t>
+            </w:r>
+          </w:p>
+        </w:tc>
+        <w:tc>
+          <w:tcPr>
+            <w:tcW w:type="dxa" w:w="1728"/>
+          </w:tcPr>
+          <w:p>
+            <w:r/>
+            <w:r>
+              <w:rPr>
+                <w:sz w:val="16"/>
+              </w:rPr>
+              <w:t>85.0</w:t>
+            </w:r>
+          </w:p>
+        </w:tc>
+        <w:tc>
+          <w:tcPr>
+            <w:tcW w:type="dxa" w:w="1728"/>
+          </w:tcPr>
+          <w:p>
+            <w:r/>
+            <w:r>
+              <w:rPr>
+                <w:sz w:val="16"/>
+              </w:rPr>
+              <w:t>Ambiguous (one-pager on request)</w:t>
+            </w:r>
+          </w:p>
+        </w:tc>
+        <w:tc>
+          <w:tcPr>
+            <w:tcW w:type="dxa" w:w="1728"/>
+          </w:tcPr>
+          <w:p>
+            <w:r/>
+            <w:r>
+              <w:rPr>
+                <w:sz w:val="16"/>
+              </w:rPr>
+              <w:t>One-pager written at user request, not a Keep verdict; see page for evidence gaps.</w:t>
+            </w:r>
+          </w:p>
+        </w:tc>
+      </w:tr>
+      <w:tr>
+        <w:tc>
+          <w:tcPr>
+            <w:tcW w:type="dxa" w:w="1728"/>
+          </w:tcPr>
+          <w:p>
+            <w:r/>
+            <w:r>
+              <w:rPr>
+                <w:sz w:val="16"/>
+              </w:rPr>
+              <w:t>Distress</w:t>
+            </w:r>
+          </w:p>
+        </w:tc>
+        <w:tc>
+          <w:tcPr>
+            <w:tcW w:type="dxa" w:w="1728"/>
+          </w:tcPr>
+          <w:p>
+            <w:r/>
+            <w:r>
+              <w:rPr>
+                <w:sz w:val="16"/>
+              </w:rPr>
+              <w:t>LODE</w:t>
+            </w:r>
+          </w:p>
+        </w:tc>
+        <w:tc>
+          <w:tcPr>
+            <w:tcW w:type="dxa" w:w="1728"/>
+          </w:tcPr>
+          <w:p>
+            <w:r/>
+            <w:r>
+              <w:rPr>
+                <w:sz w:val="16"/>
+              </w:rPr>
+              <w:t>72.5</w:t>
+            </w:r>
+          </w:p>
+        </w:tc>
+        <w:tc>
+          <w:tcPr>
+            <w:tcW w:type="dxa" w:w="1728"/>
+          </w:tcPr>
+          <w:p>
+            <w:r/>
+            <w:r>
+              <w:rPr>
+                <w:sz w:val="16"/>
+              </w:rPr>
+              <w:t>Ambiguous (one-pager on request)</w:t>
+            </w:r>
+          </w:p>
+        </w:tc>
+        <w:tc>
+          <w:tcPr>
+            <w:tcW w:type="dxa" w:w="1728"/>
+          </w:tcPr>
+          <w:p>
+            <w:r/>
+            <w:r>
+              <w:rPr>
+                <w:sz w:val="16"/>
+              </w:rPr>
+              <w:t>One-pager written at user request, not a Keep verdict; see page for evidence gaps.</w:t>
+            </w:r>
+          </w:p>
+        </w:tc>
+      </w:tr>
+      <w:tr>
+        <w:tc>
+          <w:tcPr>
+            <w:tcW w:type="dxa" w:w="1728"/>
+          </w:tcPr>
+          <w:p>
+            <w:r/>
+            <w:r>
+              <w:rPr>
+                <w:sz w:val="16"/>
+              </w:rPr>
+              <w:t>Distress</w:t>
+            </w:r>
+          </w:p>
+        </w:tc>
+        <w:tc>
+          <w:tcPr>
+            <w:tcW w:type="dxa" w:w="1728"/>
+          </w:tcPr>
+          <w:p>
+            <w:r/>
+            <w:r>
+              <w:rPr>
+                <w:sz w:val="16"/>
+              </w:rPr>
+              <w:t>RTB</w:t>
+            </w:r>
+          </w:p>
+        </w:tc>
+        <w:tc>
+          <w:tcPr>
+            <w:tcW w:type="dxa" w:w="1728"/>
+          </w:tcPr>
+          <w:p>
+            <w:r/>
+            <w:r>
+              <w:rPr>
+                <w:sz w:val="16"/>
+              </w:rPr>
+              <w:t>65.0</w:t>
+            </w:r>
+          </w:p>
+        </w:tc>
+        <w:tc>
+          <w:tcPr>
+            <w:tcW w:type="dxa" w:w="1728"/>
+          </w:tcPr>
+          <w:p>
+            <w:r/>
+            <w:r>
+              <w:rPr>
+                <w:sz w:val="16"/>
+              </w:rPr>
+              <w:t>Ambiguous (one-pager on request)</w:t>
+            </w:r>
+          </w:p>
+        </w:tc>
+        <w:tc>
+          <w:tcPr>
+            <w:tcW w:type="dxa" w:w="1728"/>
+          </w:tcPr>
+          <w:p>
+            <w:r/>
+            <w:r>
+              <w:rPr>
+                <w:sz w:val="16"/>
+              </w:rPr>
+              <w:t>One-pager written at user request, not a Keep verdict; see page for evidence gaps.</w:t>
+            </w:r>
+          </w:p>
+        </w:tc>
+      </w:tr>
+      <w:tr>
+        <w:tc>
+          <w:tcPr>
+            <w:tcW w:type="dxa" w:w="1728"/>
+          </w:tcPr>
+          <w:p>
+            <w:r/>
+            <w:r>
+              <w:rPr>
+                <w:sz w:val="16"/>
+              </w:rPr>
+              <w:t>Distress</w:t>
+            </w:r>
+          </w:p>
+        </w:tc>
+        <w:tc>
+          <w:tcPr>
+            <w:tcW w:type="dxa" w:w="1728"/>
+          </w:tcPr>
+          <w:p>
+            <w:r/>
+            <w:r>
+              <w:rPr>
+                <w:sz w:val="16"/>
+              </w:rPr>
+              <w:t>CDZI</w:t>
+            </w:r>
+          </w:p>
+        </w:tc>
+        <w:tc>
+          <w:tcPr>
+            <w:tcW w:type="dxa" w:w="1728"/>
+          </w:tcPr>
+          <w:p>
+            <w:r/>
+            <w:r>
+              <w:rPr>
+                <w:sz w:val="16"/>
+              </w:rPr>
+              <w:t>64.0</w:t>
+            </w:r>
+          </w:p>
+        </w:tc>
+        <w:tc>
+          <w:tcPr>
+            <w:tcW w:type="dxa" w:w="1728"/>
+          </w:tcPr>
+          <w:p>
+            <w:r/>
+            <w:r>
+              <w:rPr>
+                <w:sz w:val="16"/>
+              </w:rPr>
+              <w:t>Ambiguous (one-pager on request)</w:t>
+            </w:r>
+          </w:p>
+        </w:tc>
+        <w:tc>
+          <w:tcPr>
+            <w:tcW w:type="dxa" w:w="1728"/>
+          </w:tcPr>
+          <w:p>
+            <w:r/>
+            <w:r>
+              <w:rPr>
+                <w:sz w:val="16"/>
+              </w:rPr>
+              <w:t>One-pager written at user request, not a Keep verdict; see page for evidence gaps.</w:t>
+            </w:r>
+          </w:p>
+        </w:tc>
+      </w:tr>
+      <w:tr>
+        <w:tc>
+          <w:tcPr>
+            <w:tcW w:type="dxa" w:w="1728"/>
+          </w:tcPr>
+          <w:p>
+            <w:r/>
+            <w:r>
+              <w:rPr>
+                <w:sz w:val="16"/>
+              </w:rPr>
+              <w:t>Distress</w:t>
+            </w:r>
+          </w:p>
+        </w:tc>
+        <w:tc>
+          <w:tcPr>
+            <w:tcW w:type="dxa" w:w="1728"/>
+          </w:tcPr>
+          <w:p>
+            <w:r/>
+            <w:r>
+              <w:rPr>
+                <w:sz w:val="16"/>
+              </w:rPr>
+              <w:t>ATER</w:t>
+            </w:r>
+          </w:p>
+        </w:tc>
+        <w:tc>
+          <w:tcPr>
+            <w:tcW w:type="dxa" w:w="1728"/>
+          </w:tcPr>
+          <w:p>
+            <w:r/>
+            <w:r>
+              <w:rPr>
+                <w:sz w:val="16"/>
+              </w:rPr>
+              <w:t>51.8</w:t>
+            </w:r>
+          </w:p>
+        </w:tc>
+        <w:tc>
+          <w:tcPr>
+            <w:tcW w:type="dxa" w:w="1728"/>
+          </w:tcPr>
+          <w:p>
+            <w:r/>
+            <w:r>
+              <w:rPr>
+                <w:sz w:val="16"/>
+              </w:rPr>
+              <w:t>Ambiguous (one-pager on request)</w:t>
+            </w:r>
+          </w:p>
+        </w:tc>
+        <w:tc>
+          <w:tcPr>
+            <w:tcW w:type="dxa" w:w="1728"/>
+          </w:tcPr>
+          <w:p>
+            <w:r/>
+            <w:r>
+              <w:rPr>
+                <w:sz w:val="16"/>
+              </w:rPr>
+              <w:t>One-pager written at user request, not a Keep verdict; see page for evidence gaps.</w:t>
+            </w:r>
+          </w:p>
+        </w:tc>
+      </w:tr>
+      <w:tr>
+        <w:tc>
+          <w:tcPr>
+            <w:tcW w:type="dxa" w:w="1728"/>
+          </w:tcPr>
+          <w:p>
+            <w:r/>
+            <w:r>
+              <w:rPr>
+                <w:sz w:val="16"/>
+              </w:rPr>
+              <w:t>Distress</w:t>
+            </w:r>
+          </w:p>
+        </w:tc>
+        <w:tc>
+          <w:tcPr>
+            <w:tcW w:type="dxa" w:w="1728"/>
+          </w:tcPr>
+          <w:p>
+            <w:r/>
+            <w:r>
+              <w:rPr>
+                <w:sz w:val="16"/>
+              </w:rPr>
+              <w:t>AREC</w:t>
+            </w:r>
+          </w:p>
+        </w:tc>
+        <w:tc>
+          <w:tcPr>
+            <w:tcW w:type="dxa" w:w="1728"/>
+          </w:tcPr>
+          <w:p>
+            <w:r/>
+            <w:r>
+              <w:rPr>
+                <w:sz w:val="16"/>
+              </w:rPr>
+              <w:t>39.0</w:t>
+            </w:r>
+          </w:p>
+        </w:tc>
+        <w:tc>
+          <w:tcPr>
+            <w:tcW w:type="dxa" w:w="1728"/>
+          </w:tcPr>
+          <w:p>
+            <w:r/>
+            <w:r>
+              <w:rPr>
+                <w:sz w:val="16"/>
+              </w:rPr>
+              <w:t>Ambiguous (one-pager on request)</w:t>
+            </w:r>
+          </w:p>
+        </w:tc>
+        <w:tc>
+          <w:tcPr>
+            <w:tcW w:type="dxa" w:w="1728"/>
+          </w:tcPr>
+          <w:p>
+            <w:r/>
+            <w:r>
+              <w:rPr>
+                <w:sz w:val="16"/>
+              </w:rPr>
+              <w:t>One-pager written at user request, not a Keep verdict; see page for evidence gaps.</w:t>
+            </w:r>
+          </w:p>
+        </w:tc>
+      </w:tr>
+      <w:tr>
+        <w:tc>
+          <w:tcPr>
+            <w:tcW w:type="dxa" w:w="1728"/>
+          </w:tcPr>
+          <w:p>
+            <w:r/>
+            <w:r>
+              <w:rPr>
+                <w:sz w:val="16"/>
+              </w:rPr>
+              <w:t>Distress</w:t>
+            </w:r>
+          </w:p>
+        </w:tc>
+        <w:tc>
+          <w:tcPr>
+            <w:tcW w:type="dxa" w:w="1728"/>
+          </w:tcPr>
+          <w:p>
+            <w:r/>
+            <w:r>
+              <w:rPr>
+                <w:sz w:val="16"/>
+              </w:rPr>
+              <w:t>KPLT</w:t>
+            </w:r>
+          </w:p>
+        </w:tc>
+        <w:tc>
+          <w:tcPr>
+            <w:tcW w:type="dxa" w:w="1728"/>
+          </w:tcPr>
+          <w:p>
+            <w:r/>
+            <w:r>
+              <w:rPr>
+                <w:sz w:val="16"/>
+              </w:rPr>
+              <w:t>25.5</w:t>
+            </w:r>
+          </w:p>
+        </w:tc>
+        <w:tc>
+          <w:tcPr>
+            <w:tcW w:type="dxa" w:w="1728"/>
+          </w:tcPr>
+          <w:p>
+            <w:r/>
+            <w:r>
+              <w:rPr>
+                <w:sz w:val="16"/>
+              </w:rPr>
+              <w:t>Ambiguous (one-pager on request)</w:t>
+            </w:r>
+          </w:p>
+        </w:tc>
+        <w:tc>
+          <w:tcPr>
+            <w:tcW w:type="dxa" w:w="1728"/>
+          </w:tcPr>
+          <w:p>
+            <w:r/>
+            <w:r>
+              <w:rPr>
+                <w:sz w:val="16"/>
+              </w:rPr>
+              <w:t>One-pager written at user request, not a Keep verdict; see page for evidence gaps.</w:t>
+            </w:r>
+          </w:p>
+        </w:tc>
+      </w:tr>
+      <w:tr>
+        <w:tc>
+          <w:tcPr>
+            <w:tcW w:type="dxa" w:w="1728"/>
+          </w:tcPr>
+          <w:p>
+            <w:r/>
+            <w:r>
+              <w:rPr>
+                <w:sz w:val="16"/>
+              </w:rPr>
+              <w:t>Distress</w:t>
+            </w:r>
+          </w:p>
+        </w:tc>
+        <w:tc>
+          <w:tcPr>
+            <w:tcW w:type="dxa" w:w="1728"/>
+          </w:tcPr>
+          <w:p>
+            <w:r/>
+            <w:r>
+              <w:rPr>
+                <w:sz w:val="16"/>
+              </w:rPr>
+              <w:t>BGS</w:t>
+            </w:r>
+          </w:p>
+        </w:tc>
+        <w:tc>
+          <w:tcPr>
+            <w:tcW w:type="dxa" w:w="1728"/>
+          </w:tcPr>
+          <w:p>
+            <w:r/>
+            <w:r>
+              <w:rPr>
+                <w:sz w:val="16"/>
+              </w:rPr>
+              <w:t>25.0</w:t>
+            </w:r>
+          </w:p>
+        </w:tc>
+        <w:tc>
+          <w:tcPr>
+            <w:tcW w:type="dxa" w:w="1728"/>
+          </w:tcPr>
+          <w:p>
+            <w:r/>
+            <w:r>
+              <w:rPr>
+                <w:sz w:val="16"/>
+              </w:rPr>
+              <w:t>Ambiguous (one-pager on request)</w:t>
+            </w:r>
+          </w:p>
+        </w:tc>
+        <w:tc>
+          <w:tcPr>
+            <w:tcW w:type="dxa" w:w="1728"/>
+          </w:tcPr>
+          <w:p>
+            <w:r/>
+            <w:r>
+              <w:rPr>
+                <w:sz w:val="16"/>
+              </w:rPr>
+              <w:t>One-pager written at user request, not a Keep verdict; see page for evidence gaps.</w:t>
             </w:r>
           </w:p>
         </w:tc>

</xml_diff>